<commit_message>
fix: corregir XML invalido en documentos Word (Table no puede ir dentro de Paragraph)
</commit_message>
<xml_diff>
--- a/ENTREVISTA_COMPLETA_ROL1_SUPER_ADMINISTRADOR.docx
+++ b/ENTREVISTA_COMPLETA_ROL1_SUPER_ADMINISTRADOR.docx
@@ -335,7 +335,7 @@
           <w:sz w:val="18"/>
           <w:szCs w:val="18"/>
         </w:rPr>
-        <w:t xml:space="preserve">📱  Pantalla: EntrevistaScreen — Versión seleccionada</w:t>
+        <w:t xml:space="preserve">Pantalla: EntrevistaScreen — Versión seleccionada</w:t>
       </w:r>
     </w:p>
     <w:p>
@@ -352,176 +352,172 @@
           <w:sz w:val="16"/>
           <w:szCs w:val="16"/>
         </w:rPr>
-        <w:t xml:space="preserve">(Representación de la interfaz de la aplicación)</w:t>
+        <w:t xml:space="preserve">(Representacion de la interfaz de la aplicacion)</w:t>
       </w:r>
     </w:p>
-    <w:p>
-      <w:pPr>
+    <w:tbl>
+      <w:tblPr>
+        <w:tblW w:type="pct" w:w="55%"/>
         <w:jc w:val="center"/>
-      </w:pPr>
-      <w:tbl>
-        <w:tblPr>
-          <w:tblW w:type="pct" w:w="55%"/>
-          <w:tblBorders>
-            <w:top w:val="single" w:color="1B3A6B" w:sz="4"/>
-            <w:left w:val="single" w:color="1B3A6B" w:sz="4"/>
-            <w:bottom w:val="single" w:color="1B3A6B" w:sz="4"/>
-            <w:right w:val="single" w:color="1B3A6B" w:sz="4"/>
-            <w:insideH w:val="single" w:color="auto" w:sz="4"/>
-            <w:insideV w:val="single" w:color="auto" w:sz="4"/>
-          </w:tblBorders>
-        </w:tblPr>
-        <w:tblGrid>
-          <w:gridCol w:w="100"/>
-        </w:tblGrid>
-        <w:tr>
-          <w:tc>
-            <w:tcPr>
-              <w:gridSpan w:val="1"/>
-              <w:shd w:fill="1B3A6B" w:val="clear"/>
-              <w:tcMar>
-                <w:top w:type="dxa" w:w="60"/>
-                <w:left w:type="dxa" w:w="140"/>
-                <w:bottom w:type="dxa" w:w="60"/>
-                <w:right w:type="dxa" w:w="140"/>
-              </w:tcMar>
-            </w:tcPr>
-            <w:p>
-              <w:pPr>
-                <w:jc w:val="center"/>
-              </w:pPr>
-              <w:r>
-                <w:rPr>
-                  <w:rFonts w:ascii="Calibri Mono" w:cs="Calibri Mono" w:eastAsia="Calibri Mono" w:hAnsi="Calibri Mono"/>
-                  <w:b/>
-                  <w:bCs/>
-                  <w:color w:val="FFFFFF"/>
-                  <w:sz w:val="18"/>
-                  <w:szCs w:val="18"/>
-                </w:rPr>
-                <w:t xml:space="preserve">● ● ●  EntrevistaScreen — Versión seleccionada</w:t>
-              </w:r>
-            </w:p>
-          </w:tc>
-        </w:tr>
-        <w:tr>
-          <w:tc>
-            <w:tcPr>
-              <w:shd w:fill="EBF2FB" w:val="clear"/>
-              <w:tcMar>
-                <w:top w:type="dxa" w:w="50"/>
-                <w:left w:type="dxa" w:w="200"/>
-                <w:bottom w:type="dxa" w:w="50"/>
-                <w:right w:type="dxa" w:w="200"/>
-              </w:tcMar>
-            </w:tcPr>
-            <w:p>
-              <w:pPr>
-                <w:jc w:val="center"/>
-              </w:pPr>
-              <w:r>
-                <w:rPr>
-                  <w:rFonts w:ascii="Calibri" w:cs="Calibri" w:eastAsia="Calibri" w:hAnsi="Calibri"/>
-                  <w:b/>
-                  <w:bCs/>
-                  <w:color w:val="111827"/>
-                  <w:sz w:val="17"/>
-                  <w:szCs w:val="17"/>
-                </w:rPr>
-                <w:t xml:space="preserve">ENTREVISTAS</w:t>
-              </w:r>
-            </w:p>
-          </w:tc>
-        </w:tr>
-        <w:tr>
-          <w:tc>
-            <w:tcPr>
-              <w:shd w:fill="FEFCE8" w:val="clear"/>
-              <w:tcMar>
-                <w:top w:type="dxa" w:w="50"/>
-                <w:left w:type="dxa" w:w="200"/>
-                <w:bottom w:type="dxa" w:w="50"/>
-                <w:right w:type="dxa" w:w="200"/>
-              </w:tcMar>
-            </w:tcPr>
-            <w:p>
-              <w:pPr>
-                <w:jc w:val="center"/>
-              </w:pPr>
-              <w:r>
-                <w:rPr>
-                  <w:rFonts w:ascii="Calibri" w:cs="Calibri" w:eastAsia="Calibri" w:hAnsi="Calibri"/>
-                  <w:b w:val="false"/>
-                  <w:bCs w:val="false"/>
-                  <w:color w:val="111827"/>
-                  <w:sz w:val="17"/>
-                  <w:szCs w:val="17"/>
-                </w:rPr>
-                <w:t xml:space="preserve">✅  Versión 2 — Niñas, Niños y Adolescentes  ← SELECCIONADA</w:t>
-              </w:r>
-            </w:p>
-          </w:tc>
-        </w:tr>
-        <w:tr>
-          <w:tc>
-            <w:tcPr>
-              <w:shd w:fill="FFFFFF" w:val="clear"/>
-              <w:tcMar>
-                <w:top w:type="dxa" w:w="50"/>
-                <w:left w:type="dxa" w:w="200"/>
-                <w:bottom w:type="dxa" w:w="50"/>
-                <w:right w:type="dxa" w:w="200"/>
-              </w:tcMar>
-            </w:tcPr>
-            <w:p>
-              <w:pPr>
-                <w:jc w:val="center"/>
-              </w:pPr>
-              <w:r>
-                <w:rPr>
-                  <w:rFonts w:ascii="Calibri" w:cs="Calibri" w:eastAsia="Calibri" w:hAnsi="Calibri"/>
-                  <w:b w:val="false"/>
-                  <w:bCs w:val="false"/>
-                  <w:color w:val="111827"/>
-                  <w:sz w:val="17"/>
-                  <w:szCs w:val="17"/>
-                </w:rPr>
-                <w:t xml:space="preserve">Aplicado por: Carlos Andrés Gómez</w:t>
-              </w:r>
-            </w:p>
-          </w:tc>
-        </w:tr>
-        <w:tr>
-          <w:tc>
-            <w:tcPr>
-              <w:shd w:fill="DCFCE7" w:val="clear"/>
-              <w:tcMar>
-                <w:top w:type="dxa" w:w="50"/>
-                <w:left w:type="dxa" w:w="200"/>
-                <w:bottom w:type="dxa" w:w="50"/>
-                <w:right w:type="dxa" w:w="200"/>
-              </w:tcMar>
-            </w:tcPr>
-            <w:p>
-              <w:pPr>
-                <w:jc w:val="center"/>
-              </w:pPr>
-              <w:r>
-                <w:rPr>
-                  <w:rFonts w:ascii="Calibri" w:cs="Calibri" w:eastAsia="Calibri" w:hAnsi="Calibri"/>
-                  <w:b w:val="false"/>
-                  <w:bCs w:val="false"/>
-                  <w:color w:val="111827"/>
-                  <w:sz w:val="17"/>
-                  <w:szCs w:val="17"/>
-                </w:rPr>
-                <w:t xml:space="preserve">Rol: Super Administrador  ·  ID: 1202503191423</w:t>
-              </w:r>
-            </w:p>
-          </w:tc>
-        </w:tr>
-      </w:tbl>
-    </w:p>
+        <w:tblBorders>
+          <w:top w:val="single" w:color="1B3A6B" w:sz="4"/>
+          <w:left w:val="single" w:color="1B3A6B" w:sz="4"/>
+          <w:bottom w:val="single" w:color="1B3A6B" w:sz="4"/>
+          <w:right w:val="single" w:color="1B3A6B" w:sz="4"/>
+          <w:insideH w:val="single" w:color="auto" w:sz="4"/>
+          <w:insideV w:val="single" w:color="auto" w:sz="4"/>
+        </w:tblBorders>
+      </w:tblPr>
+      <w:tblGrid>
+        <w:gridCol w:w="100"/>
+      </w:tblGrid>
+      <w:tr>
+        <w:tc>
+          <w:tcPr>
+            <w:gridSpan w:val="1"/>
+            <w:shd w:fill="1B3A6B" w:val="clear"/>
+            <w:tcMar>
+              <w:top w:type="dxa" w:w="60"/>
+              <w:left w:type="dxa" w:w="140"/>
+              <w:bottom w:type="dxa" w:w="60"/>
+              <w:right w:type="dxa" w:w="140"/>
+            </w:tcMar>
+          </w:tcPr>
+          <w:p>
+            <w:pPr>
+              <w:jc w:val="center"/>
+            </w:pPr>
+            <w:r>
+              <w:rPr>
+                <w:rFonts w:ascii="Calibri Mono" w:cs="Calibri Mono" w:eastAsia="Calibri Mono" w:hAnsi="Calibri Mono"/>
+                <w:b/>
+                <w:bCs/>
+                <w:color w:val="FFFFFF"/>
+                <w:sz w:val="18"/>
+                <w:szCs w:val="18"/>
+              </w:rPr>
+              <w:t xml:space="preserve">● ● ●  EntrevistaScreen — Versión seleccionada</w:t>
+            </w:r>
+          </w:p>
+        </w:tc>
+      </w:tr>
+      <w:tr>
+        <w:tc>
+          <w:tcPr>
+            <w:shd w:fill="EBF2FB" w:val="clear"/>
+            <w:tcMar>
+              <w:top w:type="dxa" w:w="50"/>
+              <w:left w:type="dxa" w:w="200"/>
+              <w:bottom w:type="dxa" w:w="50"/>
+              <w:right w:type="dxa" w:w="200"/>
+            </w:tcMar>
+          </w:tcPr>
+          <w:p>
+            <w:pPr>
+              <w:jc w:val="center"/>
+            </w:pPr>
+            <w:r>
+              <w:rPr>
+                <w:rFonts w:ascii="Calibri" w:cs="Calibri" w:eastAsia="Calibri" w:hAnsi="Calibri"/>
+                <w:b/>
+                <w:bCs/>
+                <w:color w:val="111827"/>
+                <w:sz w:val="17"/>
+                <w:szCs w:val="17"/>
+              </w:rPr>
+              <w:t xml:space="preserve">ENTREVISTAS</w:t>
+            </w:r>
+          </w:p>
+        </w:tc>
+      </w:tr>
+      <w:tr>
+        <w:tc>
+          <w:tcPr>
+            <w:shd w:fill="FEFCE8" w:val="clear"/>
+            <w:tcMar>
+              <w:top w:type="dxa" w:w="50"/>
+              <w:left w:type="dxa" w:w="200"/>
+              <w:bottom w:type="dxa" w:w="50"/>
+              <w:right w:type="dxa" w:w="200"/>
+            </w:tcMar>
+          </w:tcPr>
+          <w:p>
+            <w:pPr>
+              <w:jc w:val="center"/>
+            </w:pPr>
+            <w:r>
+              <w:rPr>
+                <w:rFonts w:ascii="Calibri" w:cs="Calibri" w:eastAsia="Calibri" w:hAnsi="Calibri"/>
+                <w:b w:val="false"/>
+                <w:bCs w:val="false"/>
+                <w:color w:val="111827"/>
+                <w:sz w:val="17"/>
+                <w:szCs w:val="17"/>
+              </w:rPr>
+              <w:t xml:space="preserve">✅  Versión 2 — Niñas, Niños y Adolescentes  ← SELECCIONADA</w:t>
+            </w:r>
+          </w:p>
+        </w:tc>
+      </w:tr>
+      <w:tr>
+        <w:tc>
+          <w:tcPr>
+            <w:shd w:fill="FFFFFF" w:val="clear"/>
+            <w:tcMar>
+              <w:top w:type="dxa" w:w="50"/>
+              <w:left w:type="dxa" w:w="200"/>
+              <w:bottom w:type="dxa" w:w="50"/>
+              <w:right w:type="dxa" w:w="200"/>
+            </w:tcMar>
+          </w:tcPr>
+          <w:p>
+            <w:pPr>
+              <w:jc w:val="center"/>
+            </w:pPr>
+            <w:r>
+              <w:rPr>
+                <w:rFonts w:ascii="Calibri" w:cs="Calibri" w:eastAsia="Calibri" w:hAnsi="Calibri"/>
+                <w:b w:val="false"/>
+                <w:bCs w:val="false"/>
+                <w:color w:val="111827"/>
+                <w:sz w:val="17"/>
+                <w:szCs w:val="17"/>
+              </w:rPr>
+              <w:t xml:space="preserve">Aplicado por: Carlos Andrés Gómez</w:t>
+            </w:r>
+          </w:p>
+        </w:tc>
+      </w:tr>
+      <w:tr>
+        <w:tc>
+          <w:tcPr>
+            <w:shd w:fill="DCFCE7" w:val="clear"/>
+            <w:tcMar>
+              <w:top w:type="dxa" w:w="50"/>
+              <w:left w:type="dxa" w:w="200"/>
+              <w:bottom w:type="dxa" w:w="50"/>
+              <w:right w:type="dxa" w:w="200"/>
+            </w:tcMar>
+          </w:tcPr>
+          <w:p>
+            <w:pPr>
+              <w:jc w:val="center"/>
+            </w:pPr>
+            <w:r>
+              <w:rPr>
+                <w:rFonts w:ascii="Calibri" w:cs="Calibri" w:eastAsia="Calibri" w:hAnsi="Calibri"/>
+                <w:b w:val="false"/>
+                <w:bCs w:val="false"/>
+                <w:color w:val="111827"/>
+                <w:sz w:val="17"/>
+                <w:szCs w:val="17"/>
+              </w:rPr>
+              <w:t xml:space="preserve">Rol: Super Administrador  ·  ID: 1202503191423</w:t>
+            </w:r>
+          </w:p>
+        </w:tc>
+      </w:tr>
+    </w:tbl>
     <w:p>
       <w:pPr>
         <w:spacing w:after="160"/>
@@ -566,7 +562,7 @@
           <w:sz w:val="18"/>
           <w:szCs w:val="18"/>
         </w:rPr>
-        <w:t xml:space="preserve">📱  Pantalla: PasoUnoScreen — Datos Demográficos</w:t>
+        <w:t xml:space="preserve">Pantalla: PasoUnoScreen — Datos Demográficos</w:t>
       </w:r>
     </w:p>
     <w:p>
@@ -583,321 +579,317 @@
           <w:sz w:val="16"/>
           <w:szCs w:val="16"/>
         </w:rPr>
-        <w:t xml:space="preserve">(Representación de la interfaz de la aplicación)</w:t>
+        <w:t xml:space="preserve">(Representacion de la interfaz de la aplicacion)</w:t>
       </w:r>
     </w:p>
-    <w:p>
-      <w:pPr>
+    <w:tbl>
+      <w:tblPr>
+        <w:tblW w:type="pct" w:w="55%"/>
         <w:jc w:val="center"/>
-      </w:pPr>
-      <w:tbl>
-        <w:tblPr>
-          <w:tblW w:type="pct" w:w="55%"/>
-          <w:tblBorders>
-            <w:top w:val="single" w:color="1B3A6B" w:sz="4"/>
-            <w:left w:val="single" w:color="1B3A6B" w:sz="4"/>
-            <w:bottom w:val="single" w:color="1B3A6B" w:sz="4"/>
-            <w:right w:val="single" w:color="1B3A6B" w:sz="4"/>
-            <w:insideH w:val="single" w:color="auto" w:sz="4"/>
-            <w:insideV w:val="single" w:color="auto" w:sz="4"/>
-          </w:tblBorders>
-        </w:tblPr>
-        <w:tblGrid>
-          <w:gridCol w:w="100"/>
-        </w:tblGrid>
-        <w:tr>
-          <w:tc>
-            <w:tcPr>
-              <w:gridSpan w:val="1"/>
-              <w:shd w:fill="1B3A6B" w:val="clear"/>
-              <w:tcMar>
-                <w:top w:type="dxa" w:w="60"/>
-                <w:left w:type="dxa" w:w="140"/>
-                <w:bottom w:type="dxa" w:w="60"/>
-                <w:right w:type="dxa" w:w="140"/>
-              </w:tcMar>
-            </w:tcPr>
-            <w:p>
-              <w:pPr>
-                <w:jc w:val="center"/>
-              </w:pPr>
-              <w:r>
-                <w:rPr>
-                  <w:rFonts w:ascii="Calibri Mono" w:cs="Calibri Mono" w:eastAsia="Calibri Mono" w:hAnsi="Calibri Mono"/>
-                  <w:b/>
-                  <w:bCs/>
-                  <w:color w:val="FFFFFF"/>
-                  <w:sz w:val="18"/>
-                  <w:szCs w:val="18"/>
-                </w:rPr>
-                <w:t xml:space="preserve">● ● ●  PasoUnoScreen — Datos Demográficos</w:t>
-              </w:r>
-            </w:p>
-          </w:tc>
-        </w:tr>
-        <w:tr>
-          <w:tc>
-            <w:tcPr>
-              <w:shd w:fill="EBF2FB" w:val="clear"/>
-              <w:tcMar>
-                <w:top w:type="dxa" w:w="50"/>
-                <w:left w:type="dxa" w:w="200"/>
-                <w:bottom w:type="dxa" w:w="50"/>
-                <w:right w:type="dxa" w:w="200"/>
-              </w:tcMar>
-            </w:tcPr>
-            <w:p>
-              <w:pPr>
-                <w:jc w:val="center"/>
-              </w:pPr>
-              <w:r>
-                <w:rPr>
-                  <w:rFonts w:ascii="Calibri" w:cs="Calibri" w:eastAsia="Calibri" w:hAnsi="Calibri"/>
-                  <w:b/>
-                  <w:bCs/>
-                  <w:color w:val="111827"/>
-                  <w:sz w:val="17"/>
-                  <w:szCs w:val="17"/>
-                </w:rPr>
-                <w:t xml:space="preserve">ENTREVISTA — Versión 2 — Niñas, Niños y Adolescentes</w:t>
-              </w:r>
-            </w:p>
-          </w:tc>
-        </w:tr>
-        <w:tr>
-          <w:tc>
-            <w:tcPr>
-              <w:shd w:fill="F3F4F6" w:val="clear"/>
-              <w:tcMar>
-                <w:top w:type="dxa" w:w="50"/>
-                <w:left w:type="dxa" w:w="200"/>
-                <w:bottom w:type="dxa" w:w="50"/>
-                <w:right w:type="dxa" w:w="200"/>
-              </w:tcMar>
-            </w:tcPr>
-            <w:p>
-              <w:pPr>
-                <w:jc w:val="center"/>
-              </w:pPr>
-              <w:r>
-                <w:rPr>
-                  <w:rFonts w:ascii="Calibri" w:cs="Calibri" w:eastAsia="Calibri" w:hAnsi="Calibri"/>
-                  <w:b w:val="false"/>
-                  <w:bCs w:val="false"/>
-                  <w:color w:val="111827"/>
-                  <w:sz w:val="17"/>
-                  <w:szCs w:val="17"/>
-                </w:rPr>
-                <w:t xml:space="preserve">📅  Fecha de nacimiento: 04/08/2012  (13 años)</w:t>
-              </w:r>
-            </w:p>
-          </w:tc>
-        </w:tr>
-        <w:tr>
-          <w:tc>
-            <w:tcPr>
-              <w:shd w:fill="F3F4F6" w:val="clear"/>
-              <w:tcMar>
-                <w:top w:type="dxa" w:w="50"/>
-                <w:left w:type="dxa" w:w="200"/>
-                <w:bottom w:type="dxa" w:w="50"/>
-                <w:right w:type="dxa" w:w="200"/>
-              </w:tcMar>
-            </w:tcPr>
-            <w:p>
-              <w:pPr>
-                <w:jc w:val="center"/>
-              </w:pPr>
-              <w:r>
-                <w:rPr>
-                  <w:rFonts w:ascii="Calibri" w:cs="Calibri" w:eastAsia="Calibri" w:hAnsi="Calibri"/>
-                  <w:b w:val="false"/>
-                  <w:bCs w:val="false"/>
-                  <w:color w:val="111827"/>
-                  <w:sz w:val="17"/>
-                  <w:szCs w:val="17"/>
-                </w:rPr>
-                <w:t xml:space="preserve">⚧  Género: Femenino</w:t>
-              </w:r>
-            </w:p>
-          </w:tc>
-        </w:tr>
-        <w:tr>
-          <w:tc>
-            <w:tcPr>
-              <w:shd w:fill="F3F4F6" w:val="clear"/>
-              <w:tcMar>
-                <w:top w:type="dxa" w:w="50"/>
-                <w:left w:type="dxa" w:w="200"/>
-                <w:bottom w:type="dxa" w:w="50"/>
-                <w:right w:type="dxa" w:w="200"/>
-              </w:tcMar>
-            </w:tcPr>
-            <w:p>
-              <w:pPr>
-                <w:jc w:val="center"/>
-              </w:pPr>
-              <w:r>
-                <w:rPr>
-                  <w:rFonts w:ascii="Calibri" w:cs="Calibri" w:eastAsia="Calibri" w:hAnsi="Calibri"/>
-                  <w:b w:val="false"/>
-                  <w:bCs w:val="false"/>
-                  <w:color w:val="111827"/>
-                  <w:sz w:val="17"/>
-                  <w:szCs w:val="17"/>
-                </w:rPr>
-                <w:t xml:space="preserve">🏙️  Zona: Urbano</w:t>
-              </w:r>
-            </w:p>
-          </w:tc>
-        </w:tr>
-        <w:tr>
-          <w:tc>
-            <w:tcPr>
-              <w:shd w:fill="F3F4F6" w:val="clear"/>
-              <w:tcMar>
-                <w:top w:type="dxa" w:w="50"/>
-                <w:left w:type="dxa" w:w="200"/>
-                <w:bottom w:type="dxa" w:w="50"/>
-                <w:right w:type="dxa" w:w="200"/>
-              </w:tcMar>
-            </w:tcPr>
-            <w:p>
-              <w:pPr>
-                <w:jc w:val="center"/>
-              </w:pPr>
-              <w:r>
-                <w:rPr>
-                  <w:rFonts w:ascii="Calibri" w:cs="Calibri" w:eastAsia="Calibri" w:hAnsi="Calibri"/>
-                  <w:b w:val="false"/>
-                  <w:bCs w:val="false"/>
-                  <w:color w:val="111827"/>
-                  <w:sz w:val="17"/>
-                  <w:szCs w:val="17"/>
-                </w:rPr>
-                <w:t xml:space="preserve">⚔️  Conflicto armado: Sí / Desplazada</w:t>
-              </w:r>
-            </w:p>
-          </w:tc>
-        </w:tr>
-        <w:tr>
-          <w:tc>
-            <w:tcPr>
-              <w:shd w:fill="F3F4F6" w:val="clear"/>
-              <w:tcMar>
-                <w:top w:type="dxa" w:w="50"/>
-                <w:left w:type="dxa" w:w="200"/>
-                <w:bottom w:type="dxa" w:w="50"/>
-                <w:right w:type="dxa" w:w="200"/>
-              </w:tcMar>
-            </w:tcPr>
-            <w:p>
-              <w:pPr>
-                <w:jc w:val="center"/>
-              </w:pPr>
-              <w:r>
-                <w:rPr>
-                  <w:rFonts w:ascii="Calibri" w:cs="Calibri" w:eastAsia="Calibri" w:hAnsi="Calibri"/>
-                  <w:b w:val="false"/>
-                  <w:bCs w:val="false"/>
-                  <w:color w:val="111827"/>
-                  <w:sz w:val="17"/>
-                  <w:szCs w:val="17"/>
-                </w:rPr>
-                <w:t xml:space="preserve">🎭  Etnia: Afrocolombiana</w:t>
-              </w:r>
-            </w:p>
-          </w:tc>
-        </w:tr>
-        <w:tr>
-          <w:tc>
-            <w:tcPr>
-              <w:shd w:fill="F3F4F6" w:val="clear"/>
-              <w:tcMar>
-                <w:top w:type="dxa" w:w="50"/>
-                <w:left w:type="dxa" w:w="200"/>
-                <w:bottom w:type="dxa" w:w="50"/>
-                <w:right w:type="dxa" w:w="200"/>
-              </w:tcMar>
-            </w:tcPr>
-            <w:p>
-              <w:pPr>
-                <w:jc w:val="center"/>
-              </w:pPr>
-              <w:r>
-                <w:rPr>
-                  <w:rFonts w:ascii="Calibri" w:cs="Calibri" w:eastAsia="Calibri" w:hAnsi="Calibri"/>
-                  <w:b w:val="false"/>
-                  <w:bCs w:val="false"/>
-                  <w:color w:val="111827"/>
-                  <w:sz w:val="17"/>
-                  <w:szCs w:val="17"/>
-                </w:rPr>
-                <w:t xml:space="preserve">🎓  Grado: Octavo</w:t>
-              </w:r>
-            </w:p>
-          </w:tc>
-        </w:tr>
-        <w:tr>
-          <w:tc>
-            <w:tcPr>
-              <w:shd w:fill="F3F4F6" w:val="clear"/>
-              <w:tcMar>
-                <w:top w:type="dxa" w:w="50"/>
-                <w:left w:type="dxa" w:w="200"/>
-                <w:bottom w:type="dxa" w:w="50"/>
-                <w:right w:type="dxa" w:w="200"/>
-              </w:tcMar>
-            </w:tcPr>
-            <w:p>
-              <w:pPr>
-                <w:jc w:val="center"/>
-              </w:pPr>
-              <w:r>
-                <w:rPr>
-                  <w:rFonts w:ascii="Calibri" w:cs="Calibri" w:eastAsia="Calibri" w:hAnsi="Calibri"/>
-                  <w:b w:val="false"/>
-                  <w:bCs w:val="false"/>
-                  <w:color w:val="111827"/>
-                  <w:sz w:val="17"/>
-                  <w:szCs w:val="17"/>
-                </w:rPr>
-                <w:t xml:space="preserve">📍  Municipio: Medellín, Antioquia</w:t>
-              </w:r>
-            </w:p>
-          </w:tc>
-        </w:tr>
-        <w:tr>
-          <w:tc>
-            <w:tcPr>
-              <w:shd w:fill="FF007F" w:val="clear"/>
-              <w:tcMar>
-                <w:top w:type="dxa" w:w="50"/>
-                <w:left w:type="dxa" w:w="200"/>
-                <w:bottom w:type="dxa" w:w="50"/>
-                <w:right w:type="dxa" w:w="200"/>
-              </w:tcMar>
-            </w:tcPr>
-            <w:p>
-              <w:pPr>
-                <w:jc w:val="center"/>
-              </w:pPr>
-              <w:r>
-                <w:rPr>
-                  <w:rFonts w:ascii="Calibri" w:cs="Calibri" w:eastAsia="Calibri" w:hAnsi="Calibri"/>
-                  <w:b/>
-                  <w:bCs/>
-                  <w:color w:val="FFFFFF"/>
-                  <w:sz w:val="17"/>
-                  <w:szCs w:val="17"/>
-                </w:rPr>
-                <w:t xml:space="preserve">Siguiente →</w:t>
-              </w:r>
-            </w:p>
-          </w:tc>
-        </w:tr>
-      </w:tbl>
-    </w:p>
+        <w:tblBorders>
+          <w:top w:val="single" w:color="1B3A6B" w:sz="4"/>
+          <w:left w:val="single" w:color="1B3A6B" w:sz="4"/>
+          <w:bottom w:val="single" w:color="1B3A6B" w:sz="4"/>
+          <w:right w:val="single" w:color="1B3A6B" w:sz="4"/>
+          <w:insideH w:val="single" w:color="auto" w:sz="4"/>
+          <w:insideV w:val="single" w:color="auto" w:sz="4"/>
+        </w:tblBorders>
+      </w:tblPr>
+      <w:tblGrid>
+        <w:gridCol w:w="100"/>
+      </w:tblGrid>
+      <w:tr>
+        <w:tc>
+          <w:tcPr>
+            <w:gridSpan w:val="1"/>
+            <w:shd w:fill="1B3A6B" w:val="clear"/>
+            <w:tcMar>
+              <w:top w:type="dxa" w:w="60"/>
+              <w:left w:type="dxa" w:w="140"/>
+              <w:bottom w:type="dxa" w:w="60"/>
+              <w:right w:type="dxa" w:w="140"/>
+            </w:tcMar>
+          </w:tcPr>
+          <w:p>
+            <w:pPr>
+              <w:jc w:val="center"/>
+            </w:pPr>
+            <w:r>
+              <w:rPr>
+                <w:rFonts w:ascii="Calibri Mono" w:cs="Calibri Mono" w:eastAsia="Calibri Mono" w:hAnsi="Calibri Mono"/>
+                <w:b/>
+                <w:bCs/>
+                <w:color w:val="FFFFFF"/>
+                <w:sz w:val="18"/>
+                <w:szCs w:val="18"/>
+              </w:rPr>
+              <w:t xml:space="preserve">● ● ●  PasoUnoScreen — Datos Demográficos</w:t>
+            </w:r>
+          </w:p>
+        </w:tc>
+      </w:tr>
+      <w:tr>
+        <w:tc>
+          <w:tcPr>
+            <w:shd w:fill="EBF2FB" w:val="clear"/>
+            <w:tcMar>
+              <w:top w:type="dxa" w:w="50"/>
+              <w:left w:type="dxa" w:w="200"/>
+              <w:bottom w:type="dxa" w:w="50"/>
+              <w:right w:type="dxa" w:w="200"/>
+            </w:tcMar>
+          </w:tcPr>
+          <w:p>
+            <w:pPr>
+              <w:jc w:val="center"/>
+            </w:pPr>
+            <w:r>
+              <w:rPr>
+                <w:rFonts w:ascii="Calibri" w:cs="Calibri" w:eastAsia="Calibri" w:hAnsi="Calibri"/>
+                <w:b/>
+                <w:bCs/>
+                <w:color w:val="111827"/>
+                <w:sz w:val="17"/>
+                <w:szCs w:val="17"/>
+              </w:rPr>
+              <w:t xml:space="preserve">ENTREVISTA — Versión 2 — Niñas, Niños y Adolescentes</w:t>
+            </w:r>
+          </w:p>
+        </w:tc>
+      </w:tr>
+      <w:tr>
+        <w:tc>
+          <w:tcPr>
+            <w:shd w:fill="F3F4F6" w:val="clear"/>
+            <w:tcMar>
+              <w:top w:type="dxa" w:w="50"/>
+              <w:left w:type="dxa" w:w="200"/>
+              <w:bottom w:type="dxa" w:w="50"/>
+              <w:right w:type="dxa" w:w="200"/>
+            </w:tcMar>
+          </w:tcPr>
+          <w:p>
+            <w:pPr>
+              <w:jc w:val="center"/>
+            </w:pPr>
+            <w:r>
+              <w:rPr>
+                <w:rFonts w:ascii="Calibri" w:cs="Calibri" w:eastAsia="Calibri" w:hAnsi="Calibri"/>
+                <w:b w:val="false"/>
+                <w:bCs w:val="false"/>
+                <w:color w:val="111827"/>
+                <w:sz w:val="17"/>
+                <w:szCs w:val="17"/>
+              </w:rPr>
+              <w:t xml:space="preserve">📅  Fecha de nacimiento: 04/08/2012  (13 años)</w:t>
+            </w:r>
+          </w:p>
+        </w:tc>
+      </w:tr>
+      <w:tr>
+        <w:tc>
+          <w:tcPr>
+            <w:shd w:fill="F3F4F6" w:val="clear"/>
+            <w:tcMar>
+              <w:top w:type="dxa" w:w="50"/>
+              <w:left w:type="dxa" w:w="200"/>
+              <w:bottom w:type="dxa" w:w="50"/>
+              <w:right w:type="dxa" w:w="200"/>
+            </w:tcMar>
+          </w:tcPr>
+          <w:p>
+            <w:pPr>
+              <w:jc w:val="center"/>
+            </w:pPr>
+            <w:r>
+              <w:rPr>
+                <w:rFonts w:ascii="Calibri" w:cs="Calibri" w:eastAsia="Calibri" w:hAnsi="Calibri"/>
+                <w:b w:val="false"/>
+                <w:bCs w:val="false"/>
+                <w:color w:val="111827"/>
+                <w:sz w:val="17"/>
+                <w:szCs w:val="17"/>
+              </w:rPr>
+              <w:t xml:space="preserve">⚧  Género: Femenino</w:t>
+            </w:r>
+          </w:p>
+        </w:tc>
+      </w:tr>
+      <w:tr>
+        <w:tc>
+          <w:tcPr>
+            <w:shd w:fill="F3F4F6" w:val="clear"/>
+            <w:tcMar>
+              <w:top w:type="dxa" w:w="50"/>
+              <w:left w:type="dxa" w:w="200"/>
+              <w:bottom w:type="dxa" w:w="50"/>
+              <w:right w:type="dxa" w:w="200"/>
+            </w:tcMar>
+          </w:tcPr>
+          <w:p>
+            <w:pPr>
+              <w:jc w:val="center"/>
+            </w:pPr>
+            <w:r>
+              <w:rPr>
+                <w:rFonts w:ascii="Calibri" w:cs="Calibri" w:eastAsia="Calibri" w:hAnsi="Calibri"/>
+                <w:b w:val="false"/>
+                <w:bCs w:val="false"/>
+                <w:color w:val="111827"/>
+                <w:sz w:val="17"/>
+                <w:szCs w:val="17"/>
+              </w:rPr>
+              <w:t xml:space="preserve">🏙️  Zona: Urbano</w:t>
+            </w:r>
+          </w:p>
+        </w:tc>
+      </w:tr>
+      <w:tr>
+        <w:tc>
+          <w:tcPr>
+            <w:shd w:fill="F3F4F6" w:val="clear"/>
+            <w:tcMar>
+              <w:top w:type="dxa" w:w="50"/>
+              <w:left w:type="dxa" w:w="200"/>
+              <w:bottom w:type="dxa" w:w="50"/>
+              <w:right w:type="dxa" w:w="200"/>
+            </w:tcMar>
+          </w:tcPr>
+          <w:p>
+            <w:pPr>
+              <w:jc w:val="center"/>
+            </w:pPr>
+            <w:r>
+              <w:rPr>
+                <w:rFonts w:ascii="Calibri" w:cs="Calibri" w:eastAsia="Calibri" w:hAnsi="Calibri"/>
+                <w:b w:val="false"/>
+                <w:bCs w:val="false"/>
+                <w:color w:val="111827"/>
+                <w:sz w:val="17"/>
+                <w:szCs w:val="17"/>
+              </w:rPr>
+              <w:t xml:space="preserve">⚔️  Conflicto armado: Sí / Desplazada</w:t>
+            </w:r>
+          </w:p>
+        </w:tc>
+      </w:tr>
+      <w:tr>
+        <w:tc>
+          <w:tcPr>
+            <w:shd w:fill="F3F4F6" w:val="clear"/>
+            <w:tcMar>
+              <w:top w:type="dxa" w:w="50"/>
+              <w:left w:type="dxa" w:w="200"/>
+              <w:bottom w:type="dxa" w:w="50"/>
+              <w:right w:type="dxa" w:w="200"/>
+            </w:tcMar>
+          </w:tcPr>
+          <w:p>
+            <w:pPr>
+              <w:jc w:val="center"/>
+            </w:pPr>
+            <w:r>
+              <w:rPr>
+                <w:rFonts w:ascii="Calibri" w:cs="Calibri" w:eastAsia="Calibri" w:hAnsi="Calibri"/>
+                <w:b w:val="false"/>
+                <w:bCs w:val="false"/>
+                <w:color w:val="111827"/>
+                <w:sz w:val="17"/>
+                <w:szCs w:val="17"/>
+              </w:rPr>
+              <w:t xml:space="preserve">🎭  Etnia: Afrocolombiana</w:t>
+            </w:r>
+          </w:p>
+        </w:tc>
+      </w:tr>
+      <w:tr>
+        <w:tc>
+          <w:tcPr>
+            <w:shd w:fill="F3F4F6" w:val="clear"/>
+            <w:tcMar>
+              <w:top w:type="dxa" w:w="50"/>
+              <w:left w:type="dxa" w:w="200"/>
+              <w:bottom w:type="dxa" w:w="50"/>
+              <w:right w:type="dxa" w:w="200"/>
+            </w:tcMar>
+          </w:tcPr>
+          <w:p>
+            <w:pPr>
+              <w:jc w:val="center"/>
+            </w:pPr>
+            <w:r>
+              <w:rPr>
+                <w:rFonts w:ascii="Calibri" w:cs="Calibri" w:eastAsia="Calibri" w:hAnsi="Calibri"/>
+                <w:b w:val="false"/>
+                <w:bCs w:val="false"/>
+                <w:color w:val="111827"/>
+                <w:sz w:val="17"/>
+                <w:szCs w:val="17"/>
+              </w:rPr>
+              <w:t xml:space="preserve">🎓  Grado: Octavo</w:t>
+            </w:r>
+          </w:p>
+        </w:tc>
+      </w:tr>
+      <w:tr>
+        <w:tc>
+          <w:tcPr>
+            <w:shd w:fill="F3F4F6" w:val="clear"/>
+            <w:tcMar>
+              <w:top w:type="dxa" w:w="50"/>
+              <w:left w:type="dxa" w:w="200"/>
+              <w:bottom w:type="dxa" w:w="50"/>
+              <w:right w:type="dxa" w:w="200"/>
+            </w:tcMar>
+          </w:tcPr>
+          <w:p>
+            <w:pPr>
+              <w:jc w:val="center"/>
+            </w:pPr>
+            <w:r>
+              <w:rPr>
+                <w:rFonts w:ascii="Calibri" w:cs="Calibri" w:eastAsia="Calibri" w:hAnsi="Calibri"/>
+                <w:b w:val="false"/>
+                <w:bCs w:val="false"/>
+                <w:color w:val="111827"/>
+                <w:sz w:val="17"/>
+                <w:szCs w:val="17"/>
+              </w:rPr>
+              <w:t xml:space="preserve">📍  Municipio: Medellín, Antioquia</w:t>
+            </w:r>
+          </w:p>
+        </w:tc>
+      </w:tr>
+      <w:tr>
+        <w:tc>
+          <w:tcPr>
+            <w:shd w:fill="FF007F" w:val="clear"/>
+            <w:tcMar>
+              <w:top w:type="dxa" w:w="50"/>
+              <w:left w:type="dxa" w:w="200"/>
+              <w:bottom w:type="dxa" w:w="50"/>
+              <w:right w:type="dxa" w:w="200"/>
+            </w:tcMar>
+          </w:tcPr>
+          <w:p>
+            <w:pPr>
+              <w:jc w:val="center"/>
+            </w:pPr>
+            <w:r>
+              <w:rPr>
+                <w:rFonts w:ascii="Calibri" w:cs="Calibri" w:eastAsia="Calibri" w:hAnsi="Calibri"/>
+                <w:b/>
+                <w:bCs/>
+                <w:color w:val="FFFFFF"/>
+                <w:sz w:val="17"/>
+                <w:szCs w:val="17"/>
+              </w:rPr>
+              <w:t xml:space="preserve">Siguiente →</w:t>
+            </w:r>
+          </w:p>
+        </w:tc>
+      </w:tr>
+    </w:tbl>
     <w:p>
       <w:pPr>
         <w:spacing w:after="160"/>
@@ -1526,7 +1518,7 @@
           <w:sz w:val="18"/>
           <w:szCs w:val="18"/>
         </w:rPr>
-        <w:t xml:space="preserve">📱  Pantalla: PasoDosScreen — Acceso y Uso de Tecnología</w:t>
+        <w:t xml:space="preserve">Pantalla: PasoDosScreen — Acceso y Uso de Tecnología</w:t>
       </w:r>
     </w:p>
     <w:p>
@@ -1543,263 +1535,259 @@
           <w:sz w:val="16"/>
           <w:szCs w:val="16"/>
         </w:rPr>
-        <w:t xml:space="preserve">(Representación de la interfaz de la aplicación)</w:t>
+        <w:t xml:space="preserve">(Representacion de la interfaz de la aplicacion)</w:t>
       </w:r>
     </w:p>
-    <w:p>
-      <w:pPr>
+    <w:tbl>
+      <w:tblPr>
+        <w:tblW w:type="pct" w:w="55%"/>
         <w:jc w:val="center"/>
-      </w:pPr>
-      <w:tbl>
-        <w:tblPr>
-          <w:tblW w:type="pct" w:w="55%"/>
-          <w:tblBorders>
-            <w:top w:val="single" w:color="1B3A6B" w:sz="4"/>
-            <w:left w:val="single" w:color="1B3A6B" w:sz="4"/>
-            <w:bottom w:val="single" w:color="1B3A6B" w:sz="4"/>
-            <w:right w:val="single" w:color="1B3A6B" w:sz="4"/>
-            <w:insideH w:val="single" w:color="auto" w:sz="4"/>
-            <w:insideV w:val="single" w:color="auto" w:sz="4"/>
-          </w:tblBorders>
-        </w:tblPr>
-        <w:tblGrid>
-          <w:gridCol w:w="100"/>
-        </w:tblGrid>
-        <w:tr>
-          <w:tc>
-            <w:tcPr>
-              <w:gridSpan w:val="1"/>
-              <w:shd w:fill="1B3A6B" w:val="clear"/>
-              <w:tcMar>
-                <w:top w:type="dxa" w:w="60"/>
-                <w:left w:type="dxa" w:w="140"/>
-                <w:bottom w:type="dxa" w:w="60"/>
-                <w:right w:type="dxa" w:w="140"/>
-              </w:tcMar>
-            </w:tcPr>
-            <w:p>
-              <w:pPr>
-                <w:jc w:val="center"/>
-              </w:pPr>
-              <w:r>
-                <w:rPr>
-                  <w:rFonts w:ascii="Calibri Mono" w:cs="Calibri Mono" w:eastAsia="Calibri Mono" w:hAnsi="Calibri Mono"/>
-                  <w:b/>
-                  <w:bCs/>
-                  <w:color w:val="FFFFFF"/>
-                  <w:sz w:val="18"/>
-                  <w:szCs w:val="18"/>
-                </w:rPr>
-                <w:t xml:space="preserve">● ● ●  PasoDosScreen — Acceso y Uso de Tecnología</w:t>
-              </w:r>
-            </w:p>
-          </w:tc>
-        </w:tr>
-        <w:tr>
-          <w:tc>
-            <w:tcPr>
-              <w:shd w:fill="DCFCE7" w:val="clear"/>
-              <w:tcMar>
-                <w:top w:type="dxa" w:w="50"/>
-                <w:left w:type="dxa" w:w="200"/>
-                <w:bottom w:type="dxa" w:w="50"/>
-                <w:right w:type="dxa" w:w="200"/>
-              </w:tcMar>
-            </w:tcPr>
-            <w:p>
-              <w:pPr>
-                <w:jc w:val="center"/>
-              </w:pPr>
-              <w:r>
-                <w:rPr>
-                  <w:rFonts w:ascii="Calibri" w:cs="Calibri" w:eastAsia="Calibri" w:hAnsi="Calibri"/>
-                  <w:b w:val="false"/>
-                  <w:bCs w:val="false"/>
-                  <w:color w:val="111827"/>
-                  <w:sz w:val="17"/>
-                  <w:szCs w:val="17"/>
-                </w:rPr>
-                <w:t xml:space="preserve">█████████░░░░  25 %</w:t>
-              </w:r>
-            </w:p>
-          </w:tc>
-        </w:tr>
-        <w:tr>
-          <w:tc>
-            <w:tcPr>
-              <w:shd w:fill="EBF2FB" w:val="clear"/>
-              <w:tcMar>
-                <w:top w:type="dxa" w:w="50"/>
-                <w:left w:type="dxa" w:w="200"/>
-                <w:bottom w:type="dxa" w:w="50"/>
-                <w:right w:type="dxa" w:w="200"/>
-              </w:tcMar>
-            </w:tcPr>
-            <w:p>
-              <w:pPr>
-                <w:jc w:val="center"/>
-              </w:pPr>
-              <w:r>
-                <w:rPr>
-                  <w:rFonts w:ascii="Calibri" w:cs="Calibri" w:eastAsia="Calibri" w:hAnsi="Calibri"/>
-                  <w:b/>
-                  <w:bCs/>
-                  <w:color w:val="111827"/>
-                  <w:sz w:val="17"/>
-                  <w:szCs w:val="17"/>
-                </w:rPr>
-                <w:t xml:space="preserve">Acceso y Uso de Tecnología</w:t>
-              </w:r>
-            </w:p>
-          </w:tc>
-        </w:tr>
-        <w:tr>
-          <w:tc>
-            <w:tcPr>
-              <w:shd w:fill="F3F4F6" w:val="clear"/>
-              <w:tcMar>
-                <w:top w:type="dxa" w:w="50"/>
-                <w:left w:type="dxa" w:w="200"/>
-                <w:bottom w:type="dxa" w:w="50"/>
-                <w:right w:type="dxa" w:w="200"/>
-              </w:tcMar>
-            </w:tcPr>
-            <w:p>
-              <w:pPr>
-                <w:jc w:val="center"/>
-              </w:pPr>
-              <w:r>
-                <w:rPr>
-                  <w:rFonts w:ascii="Calibri" w:cs="Calibri" w:eastAsia="Calibri" w:hAnsi="Calibri"/>
-                  <w:b w:val="false"/>
-                  <w:bCs w:val="false"/>
-                  <w:color w:val="111827"/>
-                  <w:sz w:val="17"/>
-                  <w:szCs w:val="17"/>
-                </w:rPr>
-                <w:t xml:space="preserve">Indicador: [texto del indicador evaluado]</w:t>
-              </w:r>
-            </w:p>
-          </w:tc>
-        </w:tr>
-        <w:tr>
-          <w:tc>
-            <w:tcPr>
-              <w:shd w:fill="F3F4F6" w:val="clear"/>
-              <w:tcMar>
-                <w:top w:type="dxa" w:w="50"/>
-                <w:left w:type="dxa" w:w="200"/>
-                <w:bottom w:type="dxa" w:w="50"/>
-                <w:right w:type="dxa" w:w="200"/>
-              </w:tcMar>
-            </w:tcPr>
-            <w:p>
-              <w:pPr>
-                <w:jc w:val="center"/>
-              </w:pPr>
-              <w:r>
-                <w:rPr>
-                  <w:rFonts w:ascii="Calibri" w:cs="Calibri" w:eastAsia="Calibri" w:hAnsi="Calibri"/>
-                  <w:b w:val="false"/>
-                  <w:bCs w:val="false"/>
-                  <w:color w:val="111827"/>
-                  <w:sz w:val="17"/>
-                  <w:szCs w:val="17"/>
-                </w:rPr>
-                <w:t xml:space="preserve">○  Opción A (valor 0 — sin riesgo)</w:t>
-              </w:r>
-            </w:p>
-          </w:tc>
-        </w:tr>
-        <w:tr>
-          <w:tc>
-            <w:tcPr>
-              <w:shd w:fill="F3F4F6" w:val="clear"/>
-              <w:tcMar>
-                <w:top w:type="dxa" w:w="50"/>
-                <w:left w:type="dxa" w:w="200"/>
-                <w:bottom w:type="dxa" w:w="50"/>
-                <w:right w:type="dxa" w:w="200"/>
-              </w:tcMar>
-            </w:tcPr>
-            <w:p>
-              <w:pPr>
-                <w:jc w:val="center"/>
-              </w:pPr>
-              <w:r>
-                <w:rPr>
-                  <w:rFonts w:ascii="Calibri" w:cs="Calibri" w:eastAsia="Calibri" w:hAnsi="Calibri"/>
-                  <w:b w:val="false"/>
-                  <w:bCs w:val="false"/>
-                  <w:color w:val="111827"/>
-                  <w:sz w:val="17"/>
-                  <w:szCs w:val="17"/>
-                </w:rPr>
-                <w:t xml:space="preserve">○  Opción B (valor 1 — riesgo moderado)</w:t>
-              </w:r>
-            </w:p>
-          </w:tc>
-        </w:tr>
-        <w:tr>
-          <w:tc>
-            <w:tcPr>
-              <w:shd w:fill="F3F4F6" w:val="clear"/>
-              <w:tcMar>
-                <w:top w:type="dxa" w:w="50"/>
-                <w:left w:type="dxa" w:w="200"/>
-                <w:bottom w:type="dxa" w:w="50"/>
-                <w:right w:type="dxa" w:w="200"/>
-              </w:tcMar>
-            </w:tcPr>
-            <w:p>
-              <w:pPr>
-                <w:jc w:val="center"/>
-              </w:pPr>
-              <w:r>
-                <w:rPr>
-                  <w:rFonts w:ascii="Calibri" w:cs="Calibri" w:eastAsia="Calibri" w:hAnsi="Calibri"/>
-                  <w:b w:val="false"/>
-                  <w:bCs w:val="false"/>
-                  <w:color w:val="111827"/>
-                  <w:sz w:val="17"/>
-                  <w:szCs w:val="17"/>
-                </w:rPr>
-                <w:t xml:space="preserve">✅  Opción seleccionada (valor indicado)</w:t>
-              </w:r>
-            </w:p>
-          </w:tc>
-        </w:tr>
-        <w:tr>
-          <w:tc>
-            <w:tcPr>
-              <w:shd w:fill="FF007F" w:val="clear"/>
-              <w:tcMar>
-                <w:top w:type="dxa" w:w="50"/>
-                <w:left w:type="dxa" w:w="200"/>
-                <w:bottom w:type="dxa" w:w="50"/>
-                <w:right w:type="dxa" w:w="200"/>
-              </w:tcMar>
-            </w:tcPr>
-            <w:p>
-              <w:pPr>
-                <w:jc w:val="center"/>
-              </w:pPr>
-              <w:r>
-                <w:rPr>
-                  <w:rFonts w:ascii="Calibri" w:cs="Calibri" w:eastAsia="Calibri" w:hAnsi="Calibri"/>
-                  <w:b/>
-                  <w:bCs/>
-                  <w:color w:val="FFFFFF"/>
-                  <w:sz w:val="17"/>
-                  <w:szCs w:val="17"/>
-                </w:rPr>
-                <w:t xml:space="preserve">Siguiente →</w:t>
-              </w:r>
-            </w:p>
-          </w:tc>
-        </w:tr>
-      </w:tbl>
-    </w:p>
+        <w:tblBorders>
+          <w:top w:val="single" w:color="1B3A6B" w:sz="4"/>
+          <w:left w:val="single" w:color="1B3A6B" w:sz="4"/>
+          <w:bottom w:val="single" w:color="1B3A6B" w:sz="4"/>
+          <w:right w:val="single" w:color="1B3A6B" w:sz="4"/>
+          <w:insideH w:val="single" w:color="auto" w:sz="4"/>
+          <w:insideV w:val="single" w:color="auto" w:sz="4"/>
+        </w:tblBorders>
+      </w:tblPr>
+      <w:tblGrid>
+        <w:gridCol w:w="100"/>
+      </w:tblGrid>
+      <w:tr>
+        <w:tc>
+          <w:tcPr>
+            <w:gridSpan w:val="1"/>
+            <w:shd w:fill="1B3A6B" w:val="clear"/>
+            <w:tcMar>
+              <w:top w:type="dxa" w:w="60"/>
+              <w:left w:type="dxa" w:w="140"/>
+              <w:bottom w:type="dxa" w:w="60"/>
+              <w:right w:type="dxa" w:w="140"/>
+            </w:tcMar>
+          </w:tcPr>
+          <w:p>
+            <w:pPr>
+              <w:jc w:val="center"/>
+            </w:pPr>
+            <w:r>
+              <w:rPr>
+                <w:rFonts w:ascii="Calibri Mono" w:cs="Calibri Mono" w:eastAsia="Calibri Mono" w:hAnsi="Calibri Mono"/>
+                <w:b/>
+                <w:bCs/>
+                <w:color w:val="FFFFFF"/>
+                <w:sz w:val="18"/>
+                <w:szCs w:val="18"/>
+              </w:rPr>
+              <w:t xml:space="preserve">● ● ●  PasoDosScreen — Acceso y Uso de Tecnología</w:t>
+            </w:r>
+          </w:p>
+        </w:tc>
+      </w:tr>
+      <w:tr>
+        <w:tc>
+          <w:tcPr>
+            <w:shd w:fill="DCFCE7" w:val="clear"/>
+            <w:tcMar>
+              <w:top w:type="dxa" w:w="50"/>
+              <w:left w:type="dxa" w:w="200"/>
+              <w:bottom w:type="dxa" w:w="50"/>
+              <w:right w:type="dxa" w:w="200"/>
+            </w:tcMar>
+          </w:tcPr>
+          <w:p>
+            <w:pPr>
+              <w:jc w:val="center"/>
+            </w:pPr>
+            <w:r>
+              <w:rPr>
+                <w:rFonts w:ascii="Calibri" w:cs="Calibri" w:eastAsia="Calibri" w:hAnsi="Calibri"/>
+                <w:b w:val="false"/>
+                <w:bCs w:val="false"/>
+                <w:color w:val="111827"/>
+                <w:sz w:val="17"/>
+                <w:szCs w:val="17"/>
+              </w:rPr>
+              <w:t xml:space="preserve">█████████░░░░  25 %</w:t>
+            </w:r>
+          </w:p>
+        </w:tc>
+      </w:tr>
+      <w:tr>
+        <w:tc>
+          <w:tcPr>
+            <w:shd w:fill="EBF2FB" w:val="clear"/>
+            <w:tcMar>
+              <w:top w:type="dxa" w:w="50"/>
+              <w:left w:type="dxa" w:w="200"/>
+              <w:bottom w:type="dxa" w:w="50"/>
+              <w:right w:type="dxa" w:w="200"/>
+            </w:tcMar>
+          </w:tcPr>
+          <w:p>
+            <w:pPr>
+              <w:jc w:val="center"/>
+            </w:pPr>
+            <w:r>
+              <w:rPr>
+                <w:rFonts w:ascii="Calibri" w:cs="Calibri" w:eastAsia="Calibri" w:hAnsi="Calibri"/>
+                <w:b/>
+                <w:bCs/>
+                <w:color w:val="111827"/>
+                <w:sz w:val="17"/>
+                <w:szCs w:val="17"/>
+              </w:rPr>
+              <w:t xml:space="preserve">Acceso y Uso de Tecnología</w:t>
+            </w:r>
+          </w:p>
+        </w:tc>
+      </w:tr>
+      <w:tr>
+        <w:tc>
+          <w:tcPr>
+            <w:shd w:fill="F3F4F6" w:val="clear"/>
+            <w:tcMar>
+              <w:top w:type="dxa" w:w="50"/>
+              <w:left w:type="dxa" w:w="200"/>
+              <w:bottom w:type="dxa" w:w="50"/>
+              <w:right w:type="dxa" w:w="200"/>
+            </w:tcMar>
+          </w:tcPr>
+          <w:p>
+            <w:pPr>
+              <w:jc w:val="center"/>
+            </w:pPr>
+            <w:r>
+              <w:rPr>
+                <w:rFonts w:ascii="Calibri" w:cs="Calibri" w:eastAsia="Calibri" w:hAnsi="Calibri"/>
+                <w:b w:val="false"/>
+                <w:bCs w:val="false"/>
+                <w:color w:val="111827"/>
+                <w:sz w:val="17"/>
+                <w:szCs w:val="17"/>
+              </w:rPr>
+              <w:t xml:space="preserve">Indicador: [texto del indicador evaluado]</w:t>
+            </w:r>
+          </w:p>
+        </w:tc>
+      </w:tr>
+      <w:tr>
+        <w:tc>
+          <w:tcPr>
+            <w:shd w:fill="F3F4F6" w:val="clear"/>
+            <w:tcMar>
+              <w:top w:type="dxa" w:w="50"/>
+              <w:left w:type="dxa" w:w="200"/>
+              <w:bottom w:type="dxa" w:w="50"/>
+              <w:right w:type="dxa" w:w="200"/>
+            </w:tcMar>
+          </w:tcPr>
+          <w:p>
+            <w:pPr>
+              <w:jc w:val="center"/>
+            </w:pPr>
+            <w:r>
+              <w:rPr>
+                <w:rFonts w:ascii="Calibri" w:cs="Calibri" w:eastAsia="Calibri" w:hAnsi="Calibri"/>
+                <w:b w:val="false"/>
+                <w:bCs w:val="false"/>
+                <w:color w:val="111827"/>
+                <w:sz w:val="17"/>
+                <w:szCs w:val="17"/>
+              </w:rPr>
+              <w:t xml:space="preserve">○  Opción A (valor 0 — sin riesgo)</w:t>
+            </w:r>
+          </w:p>
+        </w:tc>
+      </w:tr>
+      <w:tr>
+        <w:tc>
+          <w:tcPr>
+            <w:shd w:fill="F3F4F6" w:val="clear"/>
+            <w:tcMar>
+              <w:top w:type="dxa" w:w="50"/>
+              <w:left w:type="dxa" w:w="200"/>
+              <w:bottom w:type="dxa" w:w="50"/>
+              <w:right w:type="dxa" w:w="200"/>
+            </w:tcMar>
+          </w:tcPr>
+          <w:p>
+            <w:pPr>
+              <w:jc w:val="center"/>
+            </w:pPr>
+            <w:r>
+              <w:rPr>
+                <w:rFonts w:ascii="Calibri" w:cs="Calibri" w:eastAsia="Calibri" w:hAnsi="Calibri"/>
+                <w:b w:val="false"/>
+                <w:bCs w:val="false"/>
+                <w:color w:val="111827"/>
+                <w:sz w:val="17"/>
+                <w:szCs w:val="17"/>
+              </w:rPr>
+              <w:t xml:space="preserve">○  Opción B (valor 1 — riesgo moderado)</w:t>
+            </w:r>
+          </w:p>
+        </w:tc>
+      </w:tr>
+      <w:tr>
+        <w:tc>
+          <w:tcPr>
+            <w:shd w:fill="F3F4F6" w:val="clear"/>
+            <w:tcMar>
+              <w:top w:type="dxa" w:w="50"/>
+              <w:left w:type="dxa" w:w="200"/>
+              <w:bottom w:type="dxa" w:w="50"/>
+              <w:right w:type="dxa" w:w="200"/>
+            </w:tcMar>
+          </w:tcPr>
+          <w:p>
+            <w:pPr>
+              <w:jc w:val="center"/>
+            </w:pPr>
+            <w:r>
+              <w:rPr>
+                <w:rFonts w:ascii="Calibri" w:cs="Calibri" w:eastAsia="Calibri" w:hAnsi="Calibri"/>
+                <w:b w:val="false"/>
+                <w:bCs w:val="false"/>
+                <w:color w:val="111827"/>
+                <w:sz w:val="17"/>
+                <w:szCs w:val="17"/>
+              </w:rPr>
+              <w:t xml:space="preserve">✅  Opción seleccionada (valor indicado)</w:t>
+            </w:r>
+          </w:p>
+        </w:tc>
+      </w:tr>
+      <w:tr>
+        <w:tc>
+          <w:tcPr>
+            <w:shd w:fill="FF007F" w:val="clear"/>
+            <w:tcMar>
+              <w:top w:type="dxa" w:w="50"/>
+              <w:left w:type="dxa" w:w="200"/>
+              <w:bottom w:type="dxa" w:w="50"/>
+              <w:right w:type="dxa" w:w="200"/>
+            </w:tcMar>
+          </w:tcPr>
+          <w:p>
+            <w:pPr>
+              <w:jc w:val="center"/>
+            </w:pPr>
+            <w:r>
+              <w:rPr>
+                <w:rFonts w:ascii="Calibri" w:cs="Calibri" w:eastAsia="Calibri" w:hAnsi="Calibri"/>
+                <w:b/>
+                <w:bCs/>
+                <w:color w:val="FFFFFF"/>
+                <w:sz w:val="17"/>
+                <w:szCs w:val="17"/>
+              </w:rPr>
+              <w:t xml:space="preserve">Siguiente →</w:t>
+            </w:r>
+          </w:p>
+        </w:tc>
+      </w:tr>
+    </w:tbl>
     <w:p>
       <w:pPr>
         <w:spacing w:after="160"/>
@@ -2885,7 +2873,7 @@
           <w:sz w:val="18"/>
           <w:szCs w:val="18"/>
         </w:rPr>
-        <w:t xml:space="preserve">📱  Pantalla: PasoDosScreen — Redes Sociales y Plataformas</w:t>
+        <w:t xml:space="preserve">Pantalla: PasoDosScreen — Redes Sociales y Plataformas</w:t>
       </w:r>
     </w:p>
     <w:p>
@@ -2902,263 +2890,259 @@
           <w:sz w:val="16"/>
           <w:szCs w:val="16"/>
         </w:rPr>
-        <w:t xml:space="preserve">(Representación de la interfaz de la aplicación)</w:t>
+        <w:t xml:space="preserve">(Representacion de la interfaz de la aplicacion)</w:t>
       </w:r>
     </w:p>
-    <w:p>
-      <w:pPr>
+    <w:tbl>
+      <w:tblPr>
+        <w:tblW w:type="pct" w:w="55%"/>
         <w:jc w:val="center"/>
-      </w:pPr>
-      <w:tbl>
-        <w:tblPr>
-          <w:tblW w:type="pct" w:w="55%"/>
-          <w:tblBorders>
-            <w:top w:val="single" w:color="1B3A6B" w:sz="4"/>
-            <w:left w:val="single" w:color="1B3A6B" w:sz="4"/>
-            <w:bottom w:val="single" w:color="1B3A6B" w:sz="4"/>
-            <w:right w:val="single" w:color="1B3A6B" w:sz="4"/>
-            <w:insideH w:val="single" w:color="auto" w:sz="4"/>
-            <w:insideV w:val="single" w:color="auto" w:sz="4"/>
-          </w:tblBorders>
-        </w:tblPr>
-        <w:tblGrid>
-          <w:gridCol w:w="100"/>
-        </w:tblGrid>
-        <w:tr>
-          <w:tc>
-            <w:tcPr>
-              <w:gridSpan w:val="1"/>
-              <w:shd w:fill="1B3A6B" w:val="clear"/>
-              <w:tcMar>
-                <w:top w:type="dxa" w:w="60"/>
-                <w:left w:type="dxa" w:w="140"/>
-                <w:bottom w:type="dxa" w:w="60"/>
-                <w:right w:type="dxa" w:w="140"/>
-              </w:tcMar>
-            </w:tcPr>
-            <w:p>
-              <w:pPr>
-                <w:jc w:val="center"/>
-              </w:pPr>
-              <w:r>
-                <w:rPr>
-                  <w:rFonts w:ascii="Calibri Mono" w:cs="Calibri Mono" w:eastAsia="Calibri Mono" w:hAnsi="Calibri Mono"/>
-                  <w:b/>
-                  <w:bCs/>
-                  <w:color w:val="FFFFFF"/>
-                  <w:sz w:val="18"/>
-                  <w:szCs w:val="18"/>
-                </w:rPr>
-                <w:t xml:space="preserve">● ● ●  PasoDosScreen — Redes Sociales y Plataformas</w:t>
-              </w:r>
-            </w:p>
-          </w:tc>
-        </w:tr>
-        <w:tr>
-          <w:tc>
-            <w:tcPr>
-              <w:shd w:fill="DCFCE7" w:val="clear"/>
-              <w:tcMar>
-                <w:top w:type="dxa" w:w="50"/>
-                <w:left w:type="dxa" w:w="200"/>
-                <w:bottom w:type="dxa" w:w="50"/>
-                <w:right w:type="dxa" w:w="200"/>
-              </w:tcMar>
-            </w:tcPr>
-            <w:p>
-              <w:pPr>
-                <w:jc w:val="center"/>
-              </w:pPr>
-              <w:r>
-                <w:rPr>
-                  <w:rFonts w:ascii="Calibri" w:cs="Calibri" w:eastAsia="Calibri" w:hAnsi="Calibri"/>
-                  <w:b w:val="false"/>
-                  <w:bCs w:val="false"/>
-                  <w:color w:val="111827"/>
-                  <w:sz w:val="17"/>
-                  <w:szCs w:val="17"/>
-                </w:rPr>
-                <w:t xml:space="preserve">█████████░░░░  50 %</w:t>
-              </w:r>
-            </w:p>
-          </w:tc>
-        </w:tr>
-        <w:tr>
-          <w:tc>
-            <w:tcPr>
-              <w:shd w:fill="EBF2FB" w:val="clear"/>
-              <w:tcMar>
-                <w:top w:type="dxa" w:w="50"/>
-                <w:left w:type="dxa" w:w="200"/>
-                <w:bottom w:type="dxa" w:w="50"/>
-                <w:right w:type="dxa" w:w="200"/>
-              </w:tcMar>
-            </w:tcPr>
-            <w:p>
-              <w:pPr>
-                <w:jc w:val="center"/>
-              </w:pPr>
-              <w:r>
-                <w:rPr>
-                  <w:rFonts w:ascii="Calibri" w:cs="Calibri" w:eastAsia="Calibri" w:hAnsi="Calibri"/>
-                  <w:b/>
-                  <w:bCs/>
-                  <w:color w:val="111827"/>
-                  <w:sz w:val="17"/>
-                  <w:szCs w:val="17"/>
-                </w:rPr>
-                <w:t xml:space="preserve">Redes Sociales y Plataformas</w:t>
-              </w:r>
-            </w:p>
-          </w:tc>
-        </w:tr>
-        <w:tr>
-          <w:tc>
-            <w:tcPr>
-              <w:shd w:fill="F3F4F6" w:val="clear"/>
-              <w:tcMar>
-                <w:top w:type="dxa" w:w="50"/>
-                <w:left w:type="dxa" w:w="200"/>
-                <w:bottom w:type="dxa" w:w="50"/>
-                <w:right w:type="dxa" w:w="200"/>
-              </w:tcMar>
-            </w:tcPr>
-            <w:p>
-              <w:pPr>
-                <w:jc w:val="center"/>
-              </w:pPr>
-              <w:r>
-                <w:rPr>
-                  <w:rFonts w:ascii="Calibri" w:cs="Calibri" w:eastAsia="Calibri" w:hAnsi="Calibri"/>
-                  <w:b w:val="false"/>
-                  <w:bCs w:val="false"/>
-                  <w:color w:val="111827"/>
-                  <w:sz w:val="17"/>
-                  <w:szCs w:val="17"/>
-                </w:rPr>
-                <w:t xml:space="preserve">Indicador: [texto del indicador evaluado]</w:t>
-              </w:r>
-            </w:p>
-          </w:tc>
-        </w:tr>
-        <w:tr>
-          <w:tc>
-            <w:tcPr>
-              <w:shd w:fill="F3F4F6" w:val="clear"/>
-              <w:tcMar>
-                <w:top w:type="dxa" w:w="50"/>
-                <w:left w:type="dxa" w:w="200"/>
-                <w:bottom w:type="dxa" w:w="50"/>
-                <w:right w:type="dxa" w:w="200"/>
-              </w:tcMar>
-            </w:tcPr>
-            <w:p>
-              <w:pPr>
-                <w:jc w:val="center"/>
-              </w:pPr>
-              <w:r>
-                <w:rPr>
-                  <w:rFonts w:ascii="Calibri" w:cs="Calibri" w:eastAsia="Calibri" w:hAnsi="Calibri"/>
-                  <w:b w:val="false"/>
-                  <w:bCs w:val="false"/>
-                  <w:color w:val="111827"/>
-                  <w:sz w:val="17"/>
-                  <w:szCs w:val="17"/>
-                </w:rPr>
-                <w:t xml:space="preserve">○  Opción A (valor 0 — sin riesgo)</w:t>
-              </w:r>
-            </w:p>
-          </w:tc>
-        </w:tr>
-        <w:tr>
-          <w:tc>
-            <w:tcPr>
-              <w:shd w:fill="F3F4F6" w:val="clear"/>
-              <w:tcMar>
-                <w:top w:type="dxa" w:w="50"/>
-                <w:left w:type="dxa" w:w="200"/>
-                <w:bottom w:type="dxa" w:w="50"/>
-                <w:right w:type="dxa" w:w="200"/>
-              </w:tcMar>
-            </w:tcPr>
-            <w:p>
-              <w:pPr>
-                <w:jc w:val="center"/>
-              </w:pPr>
-              <w:r>
-                <w:rPr>
-                  <w:rFonts w:ascii="Calibri" w:cs="Calibri" w:eastAsia="Calibri" w:hAnsi="Calibri"/>
-                  <w:b w:val="false"/>
-                  <w:bCs w:val="false"/>
-                  <w:color w:val="111827"/>
-                  <w:sz w:val="17"/>
-                  <w:szCs w:val="17"/>
-                </w:rPr>
-                <w:t xml:space="preserve">○  Opción B (valor 1 — riesgo moderado)</w:t>
-              </w:r>
-            </w:p>
-          </w:tc>
-        </w:tr>
-        <w:tr>
-          <w:tc>
-            <w:tcPr>
-              <w:shd w:fill="F3F4F6" w:val="clear"/>
-              <w:tcMar>
-                <w:top w:type="dxa" w:w="50"/>
-                <w:left w:type="dxa" w:w="200"/>
-                <w:bottom w:type="dxa" w:w="50"/>
-                <w:right w:type="dxa" w:w="200"/>
-              </w:tcMar>
-            </w:tcPr>
-            <w:p>
-              <w:pPr>
-                <w:jc w:val="center"/>
-              </w:pPr>
-              <w:r>
-                <w:rPr>
-                  <w:rFonts w:ascii="Calibri" w:cs="Calibri" w:eastAsia="Calibri" w:hAnsi="Calibri"/>
-                  <w:b w:val="false"/>
-                  <w:bCs w:val="false"/>
-                  <w:color w:val="111827"/>
-                  <w:sz w:val="17"/>
-                  <w:szCs w:val="17"/>
-                </w:rPr>
-                <w:t xml:space="preserve">✅  Opción seleccionada (valor indicado)</w:t>
-              </w:r>
-            </w:p>
-          </w:tc>
-        </w:tr>
-        <w:tr>
-          <w:tc>
-            <w:tcPr>
-              <w:shd w:fill="FF007F" w:val="clear"/>
-              <w:tcMar>
-                <w:top w:type="dxa" w:w="50"/>
-                <w:left w:type="dxa" w:w="200"/>
-                <w:bottom w:type="dxa" w:w="50"/>
-                <w:right w:type="dxa" w:w="200"/>
-              </w:tcMar>
-            </w:tcPr>
-            <w:p>
-              <w:pPr>
-                <w:jc w:val="center"/>
-              </w:pPr>
-              <w:r>
-                <w:rPr>
-                  <w:rFonts w:ascii="Calibri" w:cs="Calibri" w:eastAsia="Calibri" w:hAnsi="Calibri"/>
-                  <w:b/>
-                  <w:bCs/>
-                  <w:color w:val="FFFFFF"/>
-                  <w:sz w:val="17"/>
-                  <w:szCs w:val="17"/>
-                </w:rPr>
-                <w:t xml:space="preserve">Siguiente →</w:t>
-              </w:r>
-            </w:p>
-          </w:tc>
-        </w:tr>
-      </w:tbl>
-    </w:p>
+        <w:tblBorders>
+          <w:top w:val="single" w:color="1B3A6B" w:sz="4"/>
+          <w:left w:val="single" w:color="1B3A6B" w:sz="4"/>
+          <w:bottom w:val="single" w:color="1B3A6B" w:sz="4"/>
+          <w:right w:val="single" w:color="1B3A6B" w:sz="4"/>
+          <w:insideH w:val="single" w:color="auto" w:sz="4"/>
+          <w:insideV w:val="single" w:color="auto" w:sz="4"/>
+        </w:tblBorders>
+      </w:tblPr>
+      <w:tblGrid>
+        <w:gridCol w:w="100"/>
+      </w:tblGrid>
+      <w:tr>
+        <w:tc>
+          <w:tcPr>
+            <w:gridSpan w:val="1"/>
+            <w:shd w:fill="1B3A6B" w:val="clear"/>
+            <w:tcMar>
+              <w:top w:type="dxa" w:w="60"/>
+              <w:left w:type="dxa" w:w="140"/>
+              <w:bottom w:type="dxa" w:w="60"/>
+              <w:right w:type="dxa" w:w="140"/>
+            </w:tcMar>
+          </w:tcPr>
+          <w:p>
+            <w:pPr>
+              <w:jc w:val="center"/>
+            </w:pPr>
+            <w:r>
+              <w:rPr>
+                <w:rFonts w:ascii="Calibri Mono" w:cs="Calibri Mono" w:eastAsia="Calibri Mono" w:hAnsi="Calibri Mono"/>
+                <w:b/>
+                <w:bCs/>
+                <w:color w:val="FFFFFF"/>
+                <w:sz w:val="18"/>
+                <w:szCs w:val="18"/>
+              </w:rPr>
+              <w:t xml:space="preserve">● ● ●  PasoDosScreen — Redes Sociales y Plataformas</w:t>
+            </w:r>
+          </w:p>
+        </w:tc>
+      </w:tr>
+      <w:tr>
+        <w:tc>
+          <w:tcPr>
+            <w:shd w:fill="DCFCE7" w:val="clear"/>
+            <w:tcMar>
+              <w:top w:type="dxa" w:w="50"/>
+              <w:left w:type="dxa" w:w="200"/>
+              <w:bottom w:type="dxa" w:w="50"/>
+              <w:right w:type="dxa" w:w="200"/>
+            </w:tcMar>
+          </w:tcPr>
+          <w:p>
+            <w:pPr>
+              <w:jc w:val="center"/>
+            </w:pPr>
+            <w:r>
+              <w:rPr>
+                <w:rFonts w:ascii="Calibri" w:cs="Calibri" w:eastAsia="Calibri" w:hAnsi="Calibri"/>
+                <w:b w:val="false"/>
+                <w:bCs w:val="false"/>
+                <w:color w:val="111827"/>
+                <w:sz w:val="17"/>
+                <w:szCs w:val="17"/>
+              </w:rPr>
+              <w:t xml:space="preserve">█████████░░░░  50 %</w:t>
+            </w:r>
+          </w:p>
+        </w:tc>
+      </w:tr>
+      <w:tr>
+        <w:tc>
+          <w:tcPr>
+            <w:shd w:fill="EBF2FB" w:val="clear"/>
+            <w:tcMar>
+              <w:top w:type="dxa" w:w="50"/>
+              <w:left w:type="dxa" w:w="200"/>
+              <w:bottom w:type="dxa" w:w="50"/>
+              <w:right w:type="dxa" w:w="200"/>
+            </w:tcMar>
+          </w:tcPr>
+          <w:p>
+            <w:pPr>
+              <w:jc w:val="center"/>
+            </w:pPr>
+            <w:r>
+              <w:rPr>
+                <w:rFonts w:ascii="Calibri" w:cs="Calibri" w:eastAsia="Calibri" w:hAnsi="Calibri"/>
+                <w:b/>
+                <w:bCs/>
+                <w:color w:val="111827"/>
+                <w:sz w:val="17"/>
+                <w:szCs w:val="17"/>
+              </w:rPr>
+              <w:t xml:space="preserve">Redes Sociales y Plataformas</w:t>
+            </w:r>
+          </w:p>
+        </w:tc>
+      </w:tr>
+      <w:tr>
+        <w:tc>
+          <w:tcPr>
+            <w:shd w:fill="F3F4F6" w:val="clear"/>
+            <w:tcMar>
+              <w:top w:type="dxa" w:w="50"/>
+              <w:left w:type="dxa" w:w="200"/>
+              <w:bottom w:type="dxa" w:w="50"/>
+              <w:right w:type="dxa" w:w="200"/>
+            </w:tcMar>
+          </w:tcPr>
+          <w:p>
+            <w:pPr>
+              <w:jc w:val="center"/>
+            </w:pPr>
+            <w:r>
+              <w:rPr>
+                <w:rFonts w:ascii="Calibri" w:cs="Calibri" w:eastAsia="Calibri" w:hAnsi="Calibri"/>
+                <w:b w:val="false"/>
+                <w:bCs w:val="false"/>
+                <w:color w:val="111827"/>
+                <w:sz w:val="17"/>
+                <w:szCs w:val="17"/>
+              </w:rPr>
+              <w:t xml:space="preserve">Indicador: [texto del indicador evaluado]</w:t>
+            </w:r>
+          </w:p>
+        </w:tc>
+      </w:tr>
+      <w:tr>
+        <w:tc>
+          <w:tcPr>
+            <w:shd w:fill="F3F4F6" w:val="clear"/>
+            <w:tcMar>
+              <w:top w:type="dxa" w:w="50"/>
+              <w:left w:type="dxa" w:w="200"/>
+              <w:bottom w:type="dxa" w:w="50"/>
+              <w:right w:type="dxa" w:w="200"/>
+            </w:tcMar>
+          </w:tcPr>
+          <w:p>
+            <w:pPr>
+              <w:jc w:val="center"/>
+            </w:pPr>
+            <w:r>
+              <w:rPr>
+                <w:rFonts w:ascii="Calibri" w:cs="Calibri" w:eastAsia="Calibri" w:hAnsi="Calibri"/>
+                <w:b w:val="false"/>
+                <w:bCs w:val="false"/>
+                <w:color w:val="111827"/>
+                <w:sz w:val="17"/>
+                <w:szCs w:val="17"/>
+              </w:rPr>
+              <w:t xml:space="preserve">○  Opción A (valor 0 — sin riesgo)</w:t>
+            </w:r>
+          </w:p>
+        </w:tc>
+      </w:tr>
+      <w:tr>
+        <w:tc>
+          <w:tcPr>
+            <w:shd w:fill="F3F4F6" w:val="clear"/>
+            <w:tcMar>
+              <w:top w:type="dxa" w:w="50"/>
+              <w:left w:type="dxa" w:w="200"/>
+              <w:bottom w:type="dxa" w:w="50"/>
+              <w:right w:type="dxa" w:w="200"/>
+            </w:tcMar>
+          </w:tcPr>
+          <w:p>
+            <w:pPr>
+              <w:jc w:val="center"/>
+            </w:pPr>
+            <w:r>
+              <w:rPr>
+                <w:rFonts w:ascii="Calibri" w:cs="Calibri" w:eastAsia="Calibri" w:hAnsi="Calibri"/>
+                <w:b w:val="false"/>
+                <w:bCs w:val="false"/>
+                <w:color w:val="111827"/>
+                <w:sz w:val="17"/>
+                <w:szCs w:val="17"/>
+              </w:rPr>
+              <w:t xml:space="preserve">○  Opción B (valor 1 — riesgo moderado)</w:t>
+            </w:r>
+          </w:p>
+        </w:tc>
+      </w:tr>
+      <w:tr>
+        <w:tc>
+          <w:tcPr>
+            <w:shd w:fill="F3F4F6" w:val="clear"/>
+            <w:tcMar>
+              <w:top w:type="dxa" w:w="50"/>
+              <w:left w:type="dxa" w:w="200"/>
+              <w:bottom w:type="dxa" w:w="50"/>
+              <w:right w:type="dxa" w:w="200"/>
+            </w:tcMar>
+          </w:tcPr>
+          <w:p>
+            <w:pPr>
+              <w:jc w:val="center"/>
+            </w:pPr>
+            <w:r>
+              <w:rPr>
+                <w:rFonts w:ascii="Calibri" w:cs="Calibri" w:eastAsia="Calibri" w:hAnsi="Calibri"/>
+                <w:b w:val="false"/>
+                <w:bCs w:val="false"/>
+                <w:color w:val="111827"/>
+                <w:sz w:val="17"/>
+                <w:szCs w:val="17"/>
+              </w:rPr>
+              <w:t xml:space="preserve">✅  Opción seleccionada (valor indicado)</w:t>
+            </w:r>
+          </w:p>
+        </w:tc>
+      </w:tr>
+      <w:tr>
+        <w:tc>
+          <w:tcPr>
+            <w:shd w:fill="FF007F" w:val="clear"/>
+            <w:tcMar>
+              <w:top w:type="dxa" w:w="50"/>
+              <w:left w:type="dxa" w:w="200"/>
+              <w:bottom w:type="dxa" w:w="50"/>
+              <w:right w:type="dxa" w:w="200"/>
+            </w:tcMar>
+          </w:tcPr>
+          <w:p>
+            <w:pPr>
+              <w:jc w:val="center"/>
+            </w:pPr>
+            <w:r>
+              <w:rPr>
+                <w:rFonts w:ascii="Calibri" w:cs="Calibri" w:eastAsia="Calibri" w:hAnsi="Calibri"/>
+                <w:b/>
+                <w:bCs/>
+                <w:color w:val="FFFFFF"/>
+                <w:sz w:val="17"/>
+                <w:szCs w:val="17"/>
+              </w:rPr>
+              <w:t xml:space="preserve">Siguiente →</w:t>
+            </w:r>
+          </w:p>
+        </w:tc>
+      </w:tr>
+    </w:tbl>
     <w:p>
       <w:pPr>
         <w:spacing w:after="160"/>
@@ -4592,7 +4576,7 @@
           <w:sz w:val="18"/>
           <w:szCs w:val="18"/>
         </w:rPr>
-        <w:t xml:space="preserve">📱  Pantalla: PasoDosScreen — Factores de Riesgo de Explotación Digital</w:t>
+        <w:t xml:space="preserve">Pantalla: PasoDosScreen — Factores de Riesgo de Explotación Digital</w:t>
       </w:r>
     </w:p>
     <w:p>
@@ -4609,263 +4593,259 @@
           <w:sz w:val="16"/>
           <w:szCs w:val="16"/>
         </w:rPr>
-        <w:t xml:space="preserve">(Representación de la interfaz de la aplicación)</w:t>
+        <w:t xml:space="preserve">(Representacion de la interfaz de la aplicacion)</w:t>
       </w:r>
     </w:p>
-    <w:p>
-      <w:pPr>
+    <w:tbl>
+      <w:tblPr>
+        <w:tblW w:type="pct" w:w="55%"/>
         <w:jc w:val="center"/>
-      </w:pPr>
-      <w:tbl>
-        <w:tblPr>
-          <w:tblW w:type="pct" w:w="55%"/>
-          <w:tblBorders>
-            <w:top w:val="single" w:color="1B3A6B" w:sz="4"/>
-            <w:left w:val="single" w:color="1B3A6B" w:sz="4"/>
-            <w:bottom w:val="single" w:color="1B3A6B" w:sz="4"/>
-            <w:right w:val="single" w:color="1B3A6B" w:sz="4"/>
-            <w:insideH w:val="single" w:color="auto" w:sz="4"/>
-            <w:insideV w:val="single" w:color="auto" w:sz="4"/>
-          </w:tblBorders>
-        </w:tblPr>
-        <w:tblGrid>
-          <w:gridCol w:w="100"/>
-        </w:tblGrid>
-        <w:tr>
-          <w:tc>
-            <w:tcPr>
-              <w:gridSpan w:val="1"/>
-              <w:shd w:fill="1B3A6B" w:val="clear"/>
-              <w:tcMar>
-                <w:top w:type="dxa" w:w="60"/>
-                <w:left w:type="dxa" w:w="140"/>
-                <w:bottom w:type="dxa" w:w="60"/>
-                <w:right w:type="dxa" w:w="140"/>
-              </w:tcMar>
-            </w:tcPr>
-            <w:p>
-              <w:pPr>
-                <w:jc w:val="center"/>
-              </w:pPr>
-              <w:r>
-                <w:rPr>
-                  <w:rFonts w:ascii="Calibri Mono" w:cs="Calibri Mono" w:eastAsia="Calibri Mono" w:hAnsi="Calibri Mono"/>
-                  <w:b/>
-                  <w:bCs/>
-                  <w:color w:val="FFFFFF"/>
-                  <w:sz w:val="18"/>
-                  <w:szCs w:val="18"/>
-                </w:rPr>
-                <w:t xml:space="preserve">● ● ●  PasoDosScreen — Factores de Riesgo de Explotación Digital</w:t>
-              </w:r>
-            </w:p>
-          </w:tc>
-        </w:tr>
-        <w:tr>
-          <w:tc>
-            <w:tcPr>
-              <w:shd w:fill="DCFCE7" w:val="clear"/>
-              <w:tcMar>
-                <w:top w:type="dxa" w:w="50"/>
-                <w:left w:type="dxa" w:w="200"/>
-                <w:bottom w:type="dxa" w:w="50"/>
-                <w:right w:type="dxa" w:w="200"/>
-              </w:tcMar>
-            </w:tcPr>
-            <w:p>
-              <w:pPr>
-                <w:jc w:val="center"/>
-              </w:pPr>
-              <w:r>
-                <w:rPr>
-                  <w:rFonts w:ascii="Calibri" w:cs="Calibri" w:eastAsia="Calibri" w:hAnsi="Calibri"/>
-                  <w:b w:val="false"/>
-                  <w:bCs w:val="false"/>
-                  <w:color w:val="111827"/>
-                  <w:sz w:val="17"/>
-                  <w:szCs w:val="17"/>
-                </w:rPr>
-                <w:t xml:space="preserve">█████████░░░░  75 %</w:t>
-              </w:r>
-            </w:p>
-          </w:tc>
-        </w:tr>
-        <w:tr>
-          <w:tc>
-            <w:tcPr>
-              <w:shd w:fill="EBF2FB" w:val="clear"/>
-              <w:tcMar>
-                <w:top w:type="dxa" w:w="50"/>
-                <w:left w:type="dxa" w:w="200"/>
-                <w:bottom w:type="dxa" w:w="50"/>
-                <w:right w:type="dxa" w:w="200"/>
-              </w:tcMar>
-            </w:tcPr>
-            <w:p>
-              <w:pPr>
-                <w:jc w:val="center"/>
-              </w:pPr>
-              <w:r>
-                <w:rPr>
-                  <w:rFonts w:ascii="Calibri" w:cs="Calibri" w:eastAsia="Calibri" w:hAnsi="Calibri"/>
-                  <w:b/>
-                  <w:bCs/>
-                  <w:color w:val="111827"/>
-                  <w:sz w:val="17"/>
-                  <w:szCs w:val="17"/>
-                </w:rPr>
-                <w:t xml:space="preserve">Factores de Riesgo de Explotación Digital</w:t>
-              </w:r>
-            </w:p>
-          </w:tc>
-        </w:tr>
-        <w:tr>
-          <w:tc>
-            <w:tcPr>
-              <w:shd w:fill="F3F4F6" w:val="clear"/>
-              <w:tcMar>
-                <w:top w:type="dxa" w:w="50"/>
-                <w:left w:type="dxa" w:w="200"/>
-                <w:bottom w:type="dxa" w:w="50"/>
-                <w:right w:type="dxa" w:w="200"/>
-              </w:tcMar>
-            </w:tcPr>
-            <w:p>
-              <w:pPr>
-                <w:jc w:val="center"/>
-              </w:pPr>
-              <w:r>
-                <w:rPr>
-                  <w:rFonts w:ascii="Calibri" w:cs="Calibri" w:eastAsia="Calibri" w:hAnsi="Calibri"/>
-                  <w:b w:val="false"/>
-                  <w:bCs w:val="false"/>
-                  <w:color w:val="111827"/>
-                  <w:sz w:val="17"/>
-                  <w:szCs w:val="17"/>
-                </w:rPr>
-                <w:t xml:space="preserve">Indicador: [texto del indicador evaluado]</w:t>
-              </w:r>
-            </w:p>
-          </w:tc>
-        </w:tr>
-        <w:tr>
-          <w:tc>
-            <w:tcPr>
-              <w:shd w:fill="F3F4F6" w:val="clear"/>
-              <w:tcMar>
-                <w:top w:type="dxa" w:w="50"/>
-                <w:left w:type="dxa" w:w="200"/>
-                <w:bottom w:type="dxa" w:w="50"/>
-                <w:right w:type="dxa" w:w="200"/>
-              </w:tcMar>
-            </w:tcPr>
-            <w:p>
-              <w:pPr>
-                <w:jc w:val="center"/>
-              </w:pPr>
-              <w:r>
-                <w:rPr>
-                  <w:rFonts w:ascii="Calibri" w:cs="Calibri" w:eastAsia="Calibri" w:hAnsi="Calibri"/>
-                  <w:b w:val="false"/>
-                  <w:bCs w:val="false"/>
-                  <w:color w:val="111827"/>
-                  <w:sz w:val="17"/>
-                  <w:szCs w:val="17"/>
-                </w:rPr>
-                <w:t xml:space="preserve">○  Opción A (valor 0 — sin riesgo)</w:t>
-              </w:r>
-            </w:p>
-          </w:tc>
-        </w:tr>
-        <w:tr>
-          <w:tc>
-            <w:tcPr>
-              <w:shd w:fill="F3F4F6" w:val="clear"/>
-              <w:tcMar>
-                <w:top w:type="dxa" w:w="50"/>
-                <w:left w:type="dxa" w:w="200"/>
-                <w:bottom w:type="dxa" w:w="50"/>
-                <w:right w:type="dxa" w:w="200"/>
-              </w:tcMar>
-            </w:tcPr>
-            <w:p>
-              <w:pPr>
-                <w:jc w:val="center"/>
-              </w:pPr>
-              <w:r>
-                <w:rPr>
-                  <w:rFonts w:ascii="Calibri" w:cs="Calibri" w:eastAsia="Calibri" w:hAnsi="Calibri"/>
-                  <w:b w:val="false"/>
-                  <w:bCs w:val="false"/>
-                  <w:color w:val="111827"/>
-                  <w:sz w:val="17"/>
-                  <w:szCs w:val="17"/>
-                </w:rPr>
-                <w:t xml:space="preserve">○  Opción B (valor 1 — riesgo moderado)</w:t>
-              </w:r>
-            </w:p>
-          </w:tc>
-        </w:tr>
-        <w:tr>
-          <w:tc>
-            <w:tcPr>
-              <w:shd w:fill="F3F4F6" w:val="clear"/>
-              <w:tcMar>
-                <w:top w:type="dxa" w:w="50"/>
-                <w:left w:type="dxa" w:w="200"/>
-                <w:bottom w:type="dxa" w:w="50"/>
-                <w:right w:type="dxa" w:w="200"/>
-              </w:tcMar>
-            </w:tcPr>
-            <w:p>
-              <w:pPr>
-                <w:jc w:val="center"/>
-              </w:pPr>
-              <w:r>
-                <w:rPr>
-                  <w:rFonts w:ascii="Calibri" w:cs="Calibri" w:eastAsia="Calibri" w:hAnsi="Calibri"/>
-                  <w:b w:val="false"/>
-                  <w:bCs w:val="false"/>
-                  <w:color w:val="111827"/>
-                  <w:sz w:val="17"/>
-                  <w:szCs w:val="17"/>
-                </w:rPr>
-                <w:t xml:space="preserve">✅  Opción seleccionada (valor indicado)</w:t>
-              </w:r>
-            </w:p>
-          </w:tc>
-        </w:tr>
-        <w:tr>
-          <w:tc>
-            <w:tcPr>
-              <w:shd w:fill="FF007F" w:val="clear"/>
-              <w:tcMar>
-                <w:top w:type="dxa" w:w="50"/>
-                <w:left w:type="dxa" w:w="200"/>
-                <w:bottom w:type="dxa" w:w="50"/>
-                <w:right w:type="dxa" w:w="200"/>
-              </w:tcMar>
-            </w:tcPr>
-            <w:p>
-              <w:pPr>
-                <w:jc w:val="center"/>
-              </w:pPr>
-              <w:r>
-                <w:rPr>
-                  <w:rFonts w:ascii="Calibri" w:cs="Calibri" w:eastAsia="Calibri" w:hAnsi="Calibri"/>
-                  <w:b/>
-                  <w:bCs/>
-                  <w:color w:val="FFFFFF"/>
-                  <w:sz w:val="17"/>
-                  <w:szCs w:val="17"/>
-                </w:rPr>
-                <w:t xml:space="preserve">Siguiente →</w:t>
-              </w:r>
-            </w:p>
-          </w:tc>
-        </w:tr>
-      </w:tbl>
-    </w:p>
+        <w:tblBorders>
+          <w:top w:val="single" w:color="1B3A6B" w:sz="4"/>
+          <w:left w:val="single" w:color="1B3A6B" w:sz="4"/>
+          <w:bottom w:val="single" w:color="1B3A6B" w:sz="4"/>
+          <w:right w:val="single" w:color="1B3A6B" w:sz="4"/>
+          <w:insideH w:val="single" w:color="auto" w:sz="4"/>
+          <w:insideV w:val="single" w:color="auto" w:sz="4"/>
+        </w:tblBorders>
+      </w:tblPr>
+      <w:tblGrid>
+        <w:gridCol w:w="100"/>
+      </w:tblGrid>
+      <w:tr>
+        <w:tc>
+          <w:tcPr>
+            <w:gridSpan w:val="1"/>
+            <w:shd w:fill="1B3A6B" w:val="clear"/>
+            <w:tcMar>
+              <w:top w:type="dxa" w:w="60"/>
+              <w:left w:type="dxa" w:w="140"/>
+              <w:bottom w:type="dxa" w:w="60"/>
+              <w:right w:type="dxa" w:w="140"/>
+            </w:tcMar>
+          </w:tcPr>
+          <w:p>
+            <w:pPr>
+              <w:jc w:val="center"/>
+            </w:pPr>
+            <w:r>
+              <w:rPr>
+                <w:rFonts w:ascii="Calibri Mono" w:cs="Calibri Mono" w:eastAsia="Calibri Mono" w:hAnsi="Calibri Mono"/>
+                <w:b/>
+                <w:bCs/>
+                <w:color w:val="FFFFFF"/>
+                <w:sz w:val="18"/>
+                <w:szCs w:val="18"/>
+              </w:rPr>
+              <w:t xml:space="preserve">● ● ●  PasoDosScreen — Factores de Riesgo de Explotación Digital</w:t>
+            </w:r>
+          </w:p>
+        </w:tc>
+      </w:tr>
+      <w:tr>
+        <w:tc>
+          <w:tcPr>
+            <w:shd w:fill="DCFCE7" w:val="clear"/>
+            <w:tcMar>
+              <w:top w:type="dxa" w:w="50"/>
+              <w:left w:type="dxa" w:w="200"/>
+              <w:bottom w:type="dxa" w:w="50"/>
+              <w:right w:type="dxa" w:w="200"/>
+            </w:tcMar>
+          </w:tcPr>
+          <w:p>
+            <w:pPr>
+              <w:jc w:val="center"/>
+            </w:pPr>
+            <w:r>
+              <w:rPr>
+                <w:rFonts w:ascii="Calibri" w:cs="Calibri" w:eastAsia="Calibri" w:hAnsi="Calibri"/>
+                <w:b w:val="false"/>
+                <w:bCs w:val="false"/>
+                <w:color w:val="111827"/>
+                <w:sz w:val="17"/>
+                <w:szCs w:val="17"/>
+              </w:rPr>
+              <w:t xml:space="preserve">█████████░░░░  75 %</w:t>
+            </w:r>
+          </w:p>
+        </w:tc>
+      </w:tr>
+      <w:tr>
+        <w:tc>
+          <w:tcPr>
+            <w:shd w:fill="EBF2FB" w:val="clear"/>
+            <w:tcMar>
+              <w:top w:type="dxa" w:w="50"/>
+              <w:left w:type="dxa" w:w="200"/>
+              <w:bottom w:type="dxa" w:w="50"/>
+              <w:right w:type="dxa" w:w="200"/>
+            </w:tcMar>
+          </w:tcPr>
+          <w:p>
+            <w:pPr>
+              <w:jc w:val="center"/>
+            </w:pPr>
+            <w:r>
+              <w:rPr>
+                <w:rFonts w:ascii="Calibri" w:cs="Calibri" w:eastAsia="Calibri" w:hAnsi="Calibri"/>
+                <w:b/>
+                <w:bCs/>
+                <w:color w:val="111827"/>
+                <w:sz w:val="17"/>
+                <w:szCs w:val="17"/>
+              </w:rPr>
+              <w:t xml:space="preserve">Factores de Riesgo de Explotación Digital</w:t>
+            </w:r>
+          </w:p>
+        </w:tc>
+      </w:tr>
+      <w:tr>
+        <w:tc>
+          <w:tcPr>
+            <w:shd w:fill="F3F4F6" w:val="clear"/>
+            <w:tcMar>
+              <w:top w:type="dxa" w:w="50"/>
+              <w:left w:type="dxa" w:w="200"/>
+              <w:bottom w:type="dxa" w:w="50"/>
+              <w:right w:type="dxa" w:w="200"/>
+            </w:tcMar>
+          </w:tcPr>
+          <w:p>
+            <w:pPr>
+              <w:jc w:val="center"/>
+            </w:pPr>
+            <w:r>
+              <w:rPr>
+                <w:rFonts w:ascii="Calibri" w:cs="Calibri" w:eastAsia="Calibri" w:hAnsi="Calibri"/>
+                <w:b w:val="false"/>
+                <w:bCs w:val="false"/>
+                <w:color w:val="111827"/>
+                <w:sz w:val="17"/>
+                <w:szCs w:val="17"/>
+              </w:rPr>
+              <w:t xml:space="preserve">Indicador: [texto del indicador evaluado]</w:t>
+            </w:r>
+          </w:p>
+        </w:tc>
+      </w:tr>
+      <w:tr>
+        <w:tc>
+          <w:tcPr>
+            <w:shd w:fill="F3F4F6" w:val="clear"/>
+            <w:tcMar>
+              <w:top w:type="dxa" w:w="50"/>
+              <w:left w:type="dxa" w:w="200"/>
+              <w:bottom w:type="dxa" w:w="50"/>
+              <w:right w:type="dxa" w:w="200"/>
+            </w:tcMar>
+          </w:tcPr>
+          <w:p>
+            <w:pPr>
+              <w:jc w:val="center"/>
+            </w:pPr>
+            <w:r>
+              <w:rPr>
+                <w:rFonts w:ascii="Calibri" w:cs="Calibri" w:eastAsia="Calibri" w:hAnsi="Calibri"/>
+                <w:b w:val="false"/>
+                <w:bCs w:val="false"/>
+                <w:color w:val="111827"/>
+                <w:sz w:val="17"/>
+                <w:szCs w:val="17"/>
+              </w:rPr>
+              <w:t xml:space="preserve">○  Opción A (valor 0 — sin riesgo)</w:t>
+            </w:r>
+          </w:p>
+        </w:tc>
+      </w:tr>
+      <w:tr>
+        <w:tc>
+          <w:tcPr>
+            <w:shd w:fill="F3F4F6" w:val="clear"/>
+            <w:tcMar>
+              <w:top w:type="dxa" w:w="50"/>
+              <w:left w:type="dxa" w:w="200"/>
+              <w:bottom w:type="dxa" w:w="50"/>
+              <w:right w:type="dxa" w:w="200"/>
+            </w:tcMar>
+          </w:tcPr>
+          <w:p>
+            <w:pPr>
+              <w:jc w:val="center"/>
+            </w:pPr>
+            <w:r>
+              <w:rPr>
+                <w:rFonts w:ascii="Calibri" w:cs="Calibri" w:eastAsia="Calibri" w:hAnsi="Calibri"/>
+                <w:b w:val="false"/>
+                <w:bCs w:val="false"/>
+                <w:color w:val="111827"/>
+                <w:sz w:val="17"/>
+                <w:szCs w:val="17"/>
+              </w:rPr>
+              <w:t xml:space="preserve">○  Opción B (valor 1 — riesgo moderado)</w:t>
+            </w:r>
+          </w:p>
+        </w:tc>
+      </w:tr>
+      <w:tr>
+        <w:tc>
+          <w:tcPr>
+            <w:shd w:fill="F3F4F6" w:val="clear"/>
+            <w:tcMar>
+              <w:top w:type="dxa" w:w="50"/>
+              <w:left w:type="dxa" w:w="200"/>
+              <w:bottom w:type="dxa" w:w="50"/>
+              <w:right w:type="dxa" w:w="200"/>
+            </w:tcMar>
+          </w:tcPr>
+          <w:p>
+            <w:pPr>
+              <w:jc w:val="center"/>
+            </w:pPr>
+            <w:r>
+              <w:rPr>
+                <w:rFonts w:ascii="Calibri" w:cs="Calibri" w:eastAsia="Calibri" w:hAnsi="Calibri"/>
+                <w:b w:val="false"/>
+                <w:bCs w:val="false"/>
+                <w:color w:val="111827"/>
+                <w:sz w:val="17"/>
+                <w:szCs w:val="17"/>
+              </w:rPr>
+              <w:t xml:space="preserve">✅  Opción seleccionada (valor indicado)</w:t>
+            </w:r>
+          </w:p>
+        </w:tc>
+      </w:tr>
+      <w:tr>
+        <w:tc>
+          <w:tcPr>
+            <w:shd w:fill="FF007F" w:val="clear"/>
+            <w:tcMar>
+              <w:top w:type="dxa" w:w="50"/>
+              <w:left w:type="dxa" w:w="200"/>
+              <w:bottom w:type="dxa" w:w="50"/>
+              <w:right w:type="dxa" w:w="200"/>
+            </w:tcMar>
+          </w:tcPr>
+          <w:p>
+            <w:pPr>
+              <w:jc w:val="center"/>
+            </w:pPr>
+            <w:r>
+              <w:rPr>
+                <w:rFonts w:ascii="Calibri" w:cs="Calibri" w:eastAsia="Calibri" w:hAnsi="Calibri"/>
+                <w:b/>
+                <w:bCs/>
+                <w:color w:val="FFFFFF"/>
+                <w:sz w:val="17"/>
+                <w:szCs w:val="17"/>
+              </w:rPr>
+              <w:t xml:space="preserve">Siguiente →</w:t>
+            </w:r>
+          </w:p>
+        </w:tc>
+      </w:tr>
+    </w:tbl>
     <w:p>
       <w:pPr>
         <w:spacing w:after="160"/>
@@ -6299,7 +6279,7 @@
           <w:sz w:val="18"/>
           <w:szCs w:val="18"/>
         </w:rPr>
-        <w:t xml:space="preserve">📱  Pantalla: PasoDosScreen — Factores Protectores y Red de Apoyo</w:t>
+        <w:t xml:space="preserve">Pantalla: PasoDosScreen — Factores Protectores y Red de Apoyo</w:t>
       </w:r>
     </w:p>
     <w:p>
@@ -6316,263 +6296,259 @@
           <w:sz w:val="16"/>
           <w:szCs w:val="16"/>
         </w:rPr>
-        <w:t xml:space="preserve">(Representación de la interfaz de la aplicación)</w:t>
+        <w:t xml:space="preserve">(Representacion de la interfaz de la aplicacion)</w:t>
       </w:r>
     </w:p>
-    <w:p>
-      <w:pPr>
+    <w:tbl>
+      <w:tblPr>
+        <w:tblW w:type="pct" w:w="55%"/>
         <w:jc w:val="center"/>
-      </w:pPr>
-      <w:tbl>
-        <w:tblPr>
-          <w:tblW w:type="pct" w:w="55%"/>
-          <w:tblBorders>
-            <w:top w:val="single" w:color="1B3A6B" w:sz="4"/>
-            <w:left w:val="single" w:color="1B3A6B" w:sz="4"/>
-            <w:bottom w:val="single" w:color="1B3A6B" w:sz="4"/>
-            <w:right w:val="single" w:color="1B3A6B" w:sz="4"/>
-            <w:insideH w:val="single" w:color="auto" w:sz="4"/>
-            <w:insideV w:val="single" w:color="auto" w:sz="4"/>
-          </w:tblBorders>
-        </w:tblPr>
-        <w:tblGrid>
-          <w:gridCol w:w="100"/>
-        </w:tblGrid>
-        <w:tr>
-          <w:tc>
-            <w:tcPr>
-              <w:gridSpan w:val="1"/>
-              <w:shd w:fill="1B3A6B" w:val="clear"/>
-              <w:tcMar>
-                <w:top w:type="dxa" w:w="60"/>
-                <w:left w:type="dxa" w:w="140"/>
-                <w:bottom w:type="dxa" w:w="60"/>
-                <w:right w:type="dxa" w:w="140"/>
-              </w:tcMar>
-            </w:tcPr>
-            <w:p>
-              <w:pPr>
-                <w:jc w:val="center"/>
-              </w:pPr>
-              <w:r>
-                <w:rPr>
-                  <w:rFonts w:ascii="Calibri Mono" w:cs="Calibri Mono" w:eastAsia="Calibri Mono" w:hAnsi="Calibri Mono"/>
-                  <w:b/>
-                  <w:bCs/>
-                  <w:color w:val="FFFFFF"/>
-                  <w:sz w:val="18"/>
-                  <w:szCs w:val="18"/>
-                </w:rPr>
-                <w:t xml:space="preserve">● ● ●  PasoDosScreen — Factores Protectores y Red de Apoyo</w:t>
-              </w:r>
-            </w:p>
-          </w:tc>
-        </w:tr>
-        <w:tr>
-          <w:tc>
-            <w:tcPr>
-              <w:shd w:fill="DCFCE7" w:val="clear"/>
-              <w:tcMar>
-                <w:top w:type="dxa" w:w="50"/>
-                <w:left w:type="dxa" w:w="200"/>
-                <w:bottom w:type="dxa" w:w="50"/>
-                <w:right w:type="dxa" w:w="200"/>
-              </w:tcMar>
-            </w:tcPr>
-            <w:p>
-              <w:pPr>
-                <w:jc w:val="center"/>
-              </w:pPr>
-              <w:r>
-                <w:rPr>
-                  <w:rFonts w:ascii="Calibri" w:cs="Calibri" w:eastAsia="Calibri" w:hAnsi="Calibri"/>
-                  <w:b w:val="false"/>
-                  <w:bCs w:val="false"/>
-                  <w:color w:val="111827"/>
-                  <w:sz w:val="17"/>
-                  <w:szCs w:val="17"/>
-                </w:rPr>
-                <w:t xml:space="preserve">█████████░░░░  100 %</w:t>
-              </w:r>
-            </w:p>
-          </w:tc>
-        </w:tr>
-        <w:tr>
-          <w:tc>
-            <w:tcPr>
-              <w:shd w:fill="EBF2FB" w:val="clear"/>
-              <w:tcMar>
-                <w:top w:type="dxa" w:w="50"/>
-                <w:left w:type="dxa" w:w="200"/>
-                <w:bottom w:type="dxa" w:w="50"/>
-                <w:right w:type="dxa" w:w="200"/>
-              </w:tcMar>
-            </w:tcPr>
-            <w:p>
-              <w:pPr>
-                <w:jc w:val="center"/>
-              </w:pPr>
-              <w:r>
-                <w:rPr>
-                  <w:rFonts w:ascii="Calibri" w:cs="Calibri" w:eastAsia="Calibri" w:hAnsi="Calibri"/>
-                  <w:b/>
-                  <w:bCs/>
-                  <w:color w:val="111827"/>
-                  <w:sz w:val="17"/>
-                  <w:szCs w:val="17"/>
-                </w:rPr>
-                <w:t xml:space="preserve">Factores Protectores y Red de Apoyo</w:t>
-              </w:r>
-            </w:p>
-          </w:tc>
-        </w:tr>
-        <w:tr>
-          <w:tc>
-            <w:tcPr>
-              <w:shd w:fill="F3F4F6" w:val="clear"/>
-              <w:tcMar>
-                <w:top w:type="dxa" w:w="50"/>
-                <w:left w:type="dxa" w:w="200"/>
-                <w:bottom w:type="dxa" w:w="50"/>
-                <w:right w:type="dxa" w:w="200"/>
-              </w:tcMar>
-            </w:tcPr>
-            <w:p>
-              <w:pPr>
-                <w:jc w:val="center"/>
-              </w:pPr>
-              <w:r>
-                <w:rPr>
-                  <w:rFonts w:ascii="Calibri" w:cs="Calibri" w:eastAsia="Calibri" w:hAnsi="Calibri"/>
-                  <w:b w:val="false"/>
-                  <w:bCs w:val="false"/>
-                  <w:color w:val="111827"/>
-                  <w:sz w:val="17"/>
-                  <w:szCs w:val="17"/>
-                </w:rPr>
-                <w:t xml:space="preserve">Indicador: [texto del indicador evaluado]</w:t>
-              </w:r>
-            </w:p>
-          </w:tc>
-        </w:tr>
-        <w:tr>
-          <w:tc>
-            <w:tcPr>
-              <w:shd w:fill="F3F4F6" w:val="clear"/>
-              <w:tcMar>
-                <w:top w:type="dxa" w:w="50"/>
-                <w:left w:type="dxa" w:w="200"/>
-                <w:bottom w:type="dxa" w:w="50"/>
-                <w:right w:type="dxa" w:w="200"/>
-              </w:tcMar>
-            </w:tcPr>
-            <w:p>
-              <w:pPr>
-                <w:jc w:val="center"/>
-              </w:pPr>
-              <w:r>
-                <w:rPr>
-                  <w:rFonts w:ascii="Calibri" w:cs="Calibri" w:eastAsia="Calibri" w:hAnsi="Calibri"/>
-                  <w:b w:val="false"/>
-                  <w:bCs w:val="false"/>
-                  <w:color w:val="111827"/>
-                  <w:sz w:val="17"/>
-                  <w:szCs w:val="17"/>
-                </w:rPr>
-                <w:t xml:space="preserve">○  Opción A (valor 0 — sin riesgo)</w:t>
-              </w:r>
-            </w:p>
-          </w:tc>
-        </w:tr>
-        <w:tr>
-          <w:tc>
-            <w:tcPr>
-              <w:shd w:fill="F3F4F6" w:val="clear"/>
-              <w:tcMar>
-                <w:top w:type="dxa" w:w="50"/>
-                <w:left w:type="dxa" w:w="200"/>
-                <w:bottom w:type="dxa" w:w="50"/>
-                <w:right w:type="dxa" w:w="200"/>
-              </w:tcMar>
-            </w:tcPr>
-            <w:p>
-              <w:pPr>
-                <w:jc w:val="center"/>
-              </w:pPr>
-              <w:r>
-                <w:rPr>
-                  <w:rFonts w:ascii="Calibri" w:cs="Calibri" w:eastAsia="Calibri" w:hAnsi="Calibri"/>
-                  <w:b w:val="false"/>
-                  <w:bCs w:val="false"/>
-                  <w:color w:val="111827"/>
-                  <w:sz w:val="17"/>
-                  <w:szCs w:val="17"/>
-                </w:rPr>
-                <w:t xml:space="preserve">○  Opción B (valor 1 — riesgo moderado)</w:t>
-              </w:r>
-            </w:p>
-          </w:tc>
-        </w:tr>
-        <w:tr>
-          <w:tc>
-            <w:tcPr>
-              <w:shd w:fill="F3F4F6" w:val="clear"/>
-              <w:tcMar>
-                <w:top w:type="dxa" w:w="50"/>
-                <w:left w:type="dxa" w:w="200"/>
-                <w:bottom w:type="dxa" w:w="50"/>
-                <w:right w:type="dxa" w:w="200"/>
-              </w:tcMar>
-            </w:tcPr>
-            <w:p>
-              <w:pPr>
-                <w:jc w:val="center"/>
-              </w:pPr>
-              <w:r>
-                <w:rPr>
-                  <w:rFonts w:ascii="Calibri" w:cs="Calibri" w:eastAsia="Calibri" w:hAnsi="Calibri"/>
-                  <w:b w:val="false"/>
-                  <w:bCs w:val="false"/>
-                  <w:color w:val="111827"/>
-                  <w:sz w:val="17"/>
-                  <w:szCs w:val="17"/>
-                </w:rPr>
-                <w:t xml:space="preserve">✅  Opción seleccionada (valor indicado)</w:t>
-              </w:r>
-            </w:p>
-          </w:tc>
-        </w:tr>
-        <w:tr>
-          <w:tc>
-            <w:tcPr>
-              <w:shd w:fill="FF007F" w:val="clear"/>
-              <w:tcMar>
-                <w:top w:type="dxa" w:w="50"/>
-                <w:left w:type="dxa" w:w="200"/>
-                <w:bottom w:type="dxa" w:w="50"/>
-                <w:right w:type="dxa" w:w="200"/>
-              </w:tcMar>
-            </w:tcPr>
-            <w:p>
-              <w:pPr>
-                <w:jc w:val="center"/>
-              </w:pPr>
-              <w:r>
-                <w:rPr>
-                  <w:rFonts w:ascii="Calibri" w:cs="Calibri" w:eastAsia="Calibri" w:hAnsi="Calibri"/>
-                  <w:b/>
-                  <w:bCs/>
-                  <w:color w:val="FFFFFF"/>
-                  <w:sz w:val="17"/>
-                  <w:szCs w:val="17"/>
-                </w:rPr>
-                <w:t xml:space="preserve">Siguiente →</w:t>
-              </w:r>
-            </w:p>
-          </w:tc>
-        </w:tr>
-      </w:tbl>
-    </w:p>
+        <w:tblBorders>
+          <w:top w:val="single" w:color="1B3A6B" w:sz="4"/>
+          <w:left w:val="single" w:color="1B3A6B" w:sz="4"/>
+          <w:bottom w:val="single" w:color="1B3A6B" w:sz="4"/>
+          <w:right w:val="single" w:color="1B3A6B" w:sz="4"/>
+          <w:insideH w:val="single" w:color="auto" w:sz="4"/>
+          <w:insideV w:val="single" w:color="auto" w:sz="4"/>
+        </w:tblBorders>
+      </w:tblPr>
+      <w:tblGrid>
+        <w:gridCol w:w="100"/>
+      </w:tblGrid>
+      <w:tr>
+        <w:tc>
+          <w:tcPr>
+            <w:gridSpan w:val="1"/>
+            <w:shd w:fill="1B3A6B" w:val="clear"/>
+            <w:tcMar>
+              <w:top w:type="dxa" w:w="60"/>
+              <w:left w:type="dxa" w:w="140"/>
+              <w:bottom w:type="dxa" w:w="60"/>
+              <w:right w:type="dxa" w:w="140"/>
+            </w:tcMar>
+          </w:tcPr>
+          <w:p>
+            <w:pPr>
+              <w:jc w:val="center"/>
+            </w:pPr>
+            <w:r>
+              <w:rPr>
+                <w:rFonts w:ascii="Calibri Mono" w:cs="Calibri Mono" w:eastAsia="Calibri Mono" w:hAnsi="Calibri Mono"/>
+                <w:b/>
+                <w:bCs/>
+                <w:color w:val="FFFFFF"/>
+                <w:sz w:val="18"/>
+                <w:szCs w:val="18"/>
+              </w:rPr>
+              <w:t xml:space="preserve">● ● ●  PasoDosScreen — Factores Protectores y Red de Apoyo</w:t>
+            </w:r>
+          </w:p>
+        </w:tc>
+      </w:tr>
+      <w:tr>
+        <w:tc>
+          <w:tcPr>
+            <w:shd w:fill="DCFCE7" w:val="clear"/>
+            <w:tcMar>
+              <w:top w:type="dxa" w:w="50"/>
+              <w:left w:type="dxa" w:w="200"/>
+              <w:bottom w:type="dxa" w:w="50"/>
+              <w:right w:type="dxa" w:w="200"/>
+            </w:tcMar>
+          </w:tcPr>
+          <w:p>
+            <w:pPr>
+              <w:jc w:val="center"/>
+            </w:pPr>
+            <w:r>
+              <w:rPr>
+                <w:rFonts w:ascii="Calibri" w:cs="Calibri" w:eastAsia="Calibri" w:hAnsi="Calibri"/>
+                <w:b w:val="false"/>
+                <w:bCs w:val="false"/>
+                <w:color w:val="111827"/>
+                <w:sz w:val="17"/>
+                <w:szCs w:val="17"/>
+              </w:rPr>
+              <w:t xml:space="preserve">█████████░░░░  100 %</w:t>
+            </w:r>
+          </w:p>
+        </w:tc>
+      </w:tr>
+      <w:tr>
+        <w:tc>
+          <w:tcPr>
+            <w:shd w:fill="EBF2FB" w:val="clear"/>
+            <w:tcMar>
+              <w:top w:type="dxa" w:w="50"/>
+              <w:left w:type="dxa" w:w="200"/>
+              <w:bottom w:type="dxa" w:w="50"/>
+              <w:right w:type="dxa" w:w="200"/>
+            </w:tcMar>
+          </w:tcPr>
+          <w:p>
+            <w:pPr>
+              <w:jc w:val="center"/>
+            </w:pPr>
+            <w:r>
+              <w:rPr>
+                <w:rFonts w:ascii="Calibri" w:cs="Calibri" w:eastAsia="Calibri" w:hAnsi="Calibri"/>
+                <w:b/>
+                <w:bCs/>
+                <w:color w:val="111827"/>
+                <w:sz w:val="17"/>
+                <w:szCs w:val="17"/>
+              </w:rPr>
+              <w:t xml:space="preserve">Factores Protectores y Red de Apoyo</w:t>
+            </w:r>
+          </w:p>
+        </w:tc>
+      </w:tr>
+      <w:tr>
+        <w:tc>
+          <w:tcPr>
+            <w:shd w:fill="F3F4F6" w:val="clear"/>
+            <w:tcMar>
+              <w:top w:type="dxa" w:w="50"/>
+              <w:left w:type="dxa" w:w="200"/>
+              <w:bottom w:type="dxa" w:w="50"/>
+              <w:right w:type="dxa" w:w="200"/>
+            </w:tcMar>
+          </w:tcPr>
+          <w:p>
+            <w:pPr>
+              <w:jc w:val="center"/>
+            </w:pPr>
+            <w:r>
+              <w:rPr>
+                <w:rFonts w:ascii="Calibri" w:cs="Calibri" w:eastAsia="Calibri" w:hAnsi="Calibri"/>
+                <w:b w:val="false"/>
+                <w:bCs w:val="false"/>
+                <w:color w:val="111827"/>
+                <w:sz w:val="17"/>
+                <w:szCs w:val="17"/>
+              </w:rPr>
+              <w:t xml:space="preserve">Indicador: [texto del indicador evaluado]</w:t>
+            </w:r>
+          </w:p>
+        </w:tc>
+      </w:tr>
+      <w:tr>
+        <w:tc>
+          <w:tcPr>
+            <w:shd w:fill="F3F4F6" w:val="clear"/>
+            <w:tcMar>
+              <w:top w:type="dxa" w:w="50"/>
+              <w:left w:type="dxa" w:w="200"/>
+              <w:bottom w:type="dxa" w:w="50"/>
+              <w:right w:type="dxa" w:w="200"/>
+            </w:tcMar>
+          </w:tcPr>
+          <w:p>
+            <w:pPr>
+              <w:jc w:val="center"/>
+            </w:pPr>
+            <w:r>
+              <w:rPr>
+                <w:rFonts w:ascii="Calibri" w:cs="Calibri" w:eastAsia="Calibri" w:hAnsi="Calibri"/>
+                <w:b w:val="false"/>
+                <w:bCs w:val="false"/>
+                <w:color w:val="111827"/>
+                <w:sz w:val="17"/>
+                <w:szCs w:val="17"/>
+              </w:rPr>
+              <w:t xml:space="preserve">○  Opción A (valor 0 — sin riesgo)</w:t>
+            </w:r>
+          </w:p>
+        </w:tc>
+      </w:tr>
+      <w:tr>
+        <w:tc>
+          <w:tcPr>
+            <w:shd w:fill="F3F4F6" w:val="clear"/>
+            <w:tcMar>
+              <w:top w:type="dxa" w:w="50"/>
+              <w:left w:type="dxa" w:w="200"/>
+              <w:bottom w:type="dxa" w:w="50"/>
+              <w:right w:type="dxa" w:w="200"/>
+            </w:tcMar>
+          </w:tcPr>
+          <w:p>
+            <w:pPr>
+              <w:jc w:val="center"/>
+            </w:pPr>
+            <w:r>
+              <w:rPr>
+                <w:rFonts w:ascii="Calibri" w:cs="Calibri" w:eastAsia="Calibri" w:hAnsi="Calibri"/>
+                <w:b w:val="false"/>
+                <w:bCs w:val="false"/>
+                <w:color w:val="111827"/>
+                <w:sz w:val="17"/>
+                <w:szCs w:val="17"/>
+              </w:rPr>
+              <w:t xml:space="preserve">○  Opción B (valor 1 — riesgo moderado)</w:t>
+            </w:r>
+          </w:p>
+        </w:tc>
+      </w:tr>
+      <w:tr>
+        <w:tc>
+          <w:tcPr>
+            <w:shd w:fill="F3F4F6" w:val="clear"/>
+            <w:tcMar>
+              <w:top w:type="dxa" w:w="50"/>
+              <w:left w:type="dxa" w:w="200"/>
+              <w:bottom w:type="dxa" w:w="50"/>
+              <w:right w:type="dxa" w:w="200"/>
+            </w:tcMar>
+          </w:tcPr>
+          <w:p>
+            <w:pPr>
+              <w:jc w:val="center"/>
+            </w:pPr>
+            <w:r>
+              <w:rPr>
+                <w:rFonts w:ascii="Calibri" w:cs="Calibri" w:eastAsia="Calibri" w:hAnsi="Calibri"/>
+                <w:b w:val="false"/>
+                <w:bCs w:val="false"/>
+                <w:color w:val="111827"/>
+                <w:sz w:val="17"/>
+                <w:szCs w:val="17"/>
+              </w:rPr>
+              <w:t xml:space="preserve">✅  Opción seleccionada (valor indicado)</w:t>
+            </w:r>
+          </w:p>
+        </w:tc>
+      </w:tr>
+      <w:tr>
+        <w:tc>
+          <w:tcPr>
+            <w:shd w:fill="FF007F" w:val="clear"/>
+            <w:tcMar>
+              <w:top w:type="dxa" w:w="50"/>
+              <w:left w:type="dxa" w:w="200"/>
+              <w:bottom w:type="dxa" w:w="50"/>
+              <w:right w:type="dxa" w:w="200"/>
+            </w:tcMar>
+          </w:tcPr>
+          <w:p>
+            <w:pPr>
+              <w:jc w:val="center"/>
+            </w:pPr>
+            <w:r>
+              <w:rPr>
+                <w:rFonts w:ascii="Calibri" w:cs="Calibri" w:eastAsia="Calibri" w:hAnsi="Calibri"/>
+                <w:b/>
+                <w:bCs/>
+                <w:color w:val="FFFFFF"/>
+                <w:sz w:val="17"/>
+                <w:szCs w:val="17"/>
+              </w:rPr>
+              <w:t xml:space="preserve">Siguiente →</w:t>
+            </w:r>
+          </w:p>
+        </w:tc>
+      </w:tr>
+    </w:tbl>
     <w:p>
       <w:pPr>
         <w:spacing w:after="160"/>
@@ -7666,7 +7642,7 @@
           <w:sz w:val="18"/>
           <w:szCs w:val="18"/>
         </w:rPr>
-        <w:t xml:space="preserve">📱  Pantalla: PasoComentarioScreen — Observaciones</w:t>
+        <w:t xml:space="preserve">Pantalla: PasoComentarioScreen — Observaciones</w:t>
       </w:r>
     </w:p>
     <w:p>
@@ -7683,176 +7659,172 @@
           <w:sz w:val="16"/>
           <w:szCs w:val="16"/>
         </w:rPr>
-        <w:t xml:space="preserve">(Representación de la interfaz de la aplicación)</w:t>
+        <w:t xml:space="preserve">(Representacion de la interfaz de la aplicacion)</w:t>
       </w:r>
     </w:p>
-    <w:p>
-      <w:pPr>
+    <w:tbl>
+      <w:tblPr>
+        <w:tblW w:type="pct" w:w="55%"/>
         <w:jc w:val="center"/>
-      </w:pPr>
-      <w:tbl>
-        <w:tblPr>
-          <w:tblW w:type="pct" w:w="55%"/>
-          <w:tblBorders>
-            <w:top w:val="single" w:color="1B3A6B" w:sz="4"/>
-            <w:left w:val="single" w:color="1B3A6B" w:sz="4"/>
-            <w:bottom w:val="single" w:color="1B3A6B" w:sz="4"/>
-            <w:right w:val="single" w:color="1B3A6B" w:sz="4"/>
-            <w:insideH w:val="single" w:color="auto" w:sz="4"/>
-            <w:insideV w:val="single" w:color="auto" w:sz="4"/>
-          </w:tblBorders>
-        </w:tblPr>
-        <w:tblGrid>
-          <w:gridCol w:w="100"/>
-        </w:tblGrid>
-        <w:tr>
-          <w:tc>
-            <w:tcPr>
-              <w:gridSpan w:val="1"/>
-              <w:shd w:fill="1B3A6B" w:val="clear"/>
-              <w:tcMar>
-                <w:top w:type="dxa" w:w="60"/>
-                <w:left w:type="dxa" w:w="140"/>
-                <w:bottom w:type="dxa" w:w="60"/>
-                <w:right w:type="dxa" w:w="140"/>
-              </w:tcMar>
-            </w:tcPr>
-            <w:p>
-              <w:pPr>
-                <w:jc w:val="center"/>
-              </w:pPr>
-              <w:r>
-                <w:rPr>
-                  <w:rFonts w:ascii="Calibri Mono" w:cs="Calibri Mono" w:eastAsia="Calibri Mono" w:hAnsi="Calibri Mono"/>
-                  <w:b/>
-                  <w:bCs/>
-                  <w:color w:val="FFFFFF"/>
-                  <w:sz w:val="18"/>
-                  <w:szCs w:val="18"/>
-                </w:rPr>
-                <w:t xml:space="preserve">● ● ●  PasoComentarioScreen — Observaciones</w:t>
-              </w:r>
-            </w:p>
-          </w:tc>
-        </w:tr>
-        <w:tr>
-          <w:tc>
-            <w:tcPr>
-              <w:shd w:fill="DCFCE7" w:val="clear"/>
-              <w:tcMar>
-                <w:top w:type="dxa" w:w="50"/>
-                <w:left w:type="dxa" w:w="200"/>
-                <w:bottom w:type="dxa" w:w="50"/>
-                <w:right w:type="dxa" w:w="200"/>
-              </w:tcMar>
-            </w:tcPr>
-            <w:p>
-              <w:pPr>
-                <w:jc w:val="center"/>
-              </w:pPr>
-              <w:r>
-                <w:rPr>
-                  <w:rFonts w:ascii="Calibri" w:cs="Calibri" w:eastAsia="Calibri" w:hAnsi="Calibri"/>
-                  <w:b w:val="false"/>
-                  <w:bCs w:val="false"/>
-                  <w:color w:val="111827"/>
-                  <w:sz w:val="17"/>
-                  <w:szCs w:val="17"/>
-                </w:rPr>
-                <w:t xml:space="preserve">████████████████  100 %</w:t>
-              </w:r>
-            </w:p>
-          </w:tc>
-        </w:tr>
-        <w:tr>
-          <w:tc>
-            <w:tcPr>
-              <w:shd w:fill="EBF2FB" w:val="clear"/>
-              <w:tcMar>
-                <w:top w:type="dxa" w:w="50"/>
-                <w:left w:type="dxa" w:w="200"/>
-                <w:bottom w:type="dxa" w:w="50"/>
-                <w:right w:type="dxa" w:w="200"/>
-              </w:tcMar>
-            </w:tcPr>
-            <w:p>
-              <w:pPr>
-                <w:jc w:val="center"/>
-              </w:pPr>
-              <w:r>
-                <w:rPr>
-                  <w:rFonts w:ascii="Calibri" w:cs="Calibri" w:eastAsia="Calibri" w:hAnsi="Calibri"/>
-                  <w:b/>
-                  <w:bCs/>
-                  <w:color w:val="111827"/>
-                  <w:sz w:val="17"/>
-                  <w:szCs w:val="17"/>
-                </w:rPr>
-                <w:t xml:space="preserve">¿Qué redes sociales, videojuegos o plataformas utiliza...?</w:t>
-              </w:r>
-            </w:p>
-          </w:tc>
-        </w:tr>
-        <w:tr>
-          <w:tc>
-            <w:tcPr>
-              <w:shd w:fill="F3F4F6" w:val="clear"/>
-              <w:tcMar>
-                <w:top w:type="dxa" w:w="50"/>
-                <w:left w:type="dxa" w:w="200"/>
-                <w:bottom w:type="dxa" w:w="50"/>
-                <w:right w:type="dxa" w:w="200"/>
-              </w:tcMar>
-            </w:tcPr>
-            <w:p>
-              <w:pPr>
-                <w:jc w:val="center"/>
-              </w:pPr>
-              <w:r>
-                <w:rPr>
-                  <w:rFonts w:ascii="Calibri" w:cs="Calibri" w:eastAsia="Calibri" w:hAnsi="Calibri"/>
-                  <w:b w:val="false"/>
-                  <w:bCs w:val="false"/>
-                  <w:color w:val="111827"/>
-                  <w:sz w:val="17"/>
-                  <w:szCs w:val="17"/>
-                </w:rPr>
-                <w:t xml:space="preserve">[Área de texto libre con observaciones del aplicador]</w:t>
-              </w:r>
-            </w:p>
-          </w:tc>
-        </w:tr>
-        <w:tr>
-          <w:tc>
-            <w:tcPr>
-              <w:shd w:fill="FF007F" w:val="clear"/>
-              <w:tcMar>
-                <w:top w:type="dxa" w:w="50"/>
-                <w:left w:type="dxa" w:w="200"/>
-                <w:bottom w:type="dxa" w:w="50"/>
-                <w:right w:type="dxa" w:w="200"/>
-              </w:tcMar>
-            </w:tcPr>
-            <w:p>
-              <w:pPr>
-                <w:jc w:val="center"/>
-              </w:pPr>
-              <w:r>
-                <w:rPr>
-                  <w:rFonts w:ascii="Calibri" w:cs="Calibri" w:eastAsia="Calibri" w:hAnsi="Calibri"/>
-                  <w:b/>
-                  <w:bCs/>
-                  <w:color w:val="FFFFFF"/>
-                  <w:sz w:val="17"/>
-                  <w:szCs w:val="17"/>
-                </w:rPr>
-                <w:t xml:space="preserve">Ver Resultados</w:t>
-              </w:r>
-            </w:p>
-          </w:tc>
-        </w:tr>
-      </w:tbl>
-    </w:p>
+        <w:tblBorders>
+          <w:top w:val="single" w:color="1B3A6B" w:sz="4"/>
+          <w:left w:val="single" w:color="1B3A6B" w:sz="4"/>
+          <w:bottom w:val="single" w:color="1B3A6B" w:sz="4"/>
+          <w:right w:val="single" w:color="1B3A6B" w:sz="4"/>
+          <w:insideH w:val="single" w:color="auto" w:sz="4"/>
+          <w:insideV w:val="single" w:color="auto" w:sz="4"/>
+        </w:tblBorders>
+      </w:tblPr>
+      <w:tblGrid>
+        <w:gridCol w:w="100"/>
+      </w:tblGrid>
+      <w:tr>
+        <w:tc>
+          <w:tcPr>
+            <w:gridSpan w:val="1"/>
+            <w:shd w:fill="1B3A6B" w:val="clear"/>
+            <w:tcMar>
+              <w:top w:type="dxa" w:w="60"/>
+              <w:left w:type="dxa" w:w="140"/>
+              <w:bottom w:type="dxa" w:w="60"/>
+              <w:right w:type="dxa" w:w="140"/>
+            </w:tcMar>
+          </w:tcPr>
+          <w:p>
+            <w:pPr>
+              <w:jc w:val="center"/>
+            </w:pPr>
+            <w:r>
+              <w:rPr>
+                <w:rFonts w:ascii="Calibri Mono" w:cs="Calibri Mono" w:eastAsia="Calibri Mono" w:hAnsi="Calibri Mono"/>
+                <w:b/>
+                <w:bCs/>
+                <w:color w:val="FFFFFF"/>
+                <w:sz w:val="18"/>
+                <w:szCs w:val="18"/>
+              </w:rPr>
+              <w:t xml:space="preserve">● ● ●  PasoComentarioScreen — Observaciones</w:t>
+            </w:r>
+          </w:p>
+        </w:tc>
+      </w:tr>
+      <w:tr>
+        <w:tc>
+          <w:tcPr>
+            <w:shd w:fill="DCFCE7" w:val="clear"/>
+            <w:tcMar>
+              <w:top w:type="dxa" w:w="50"/>
+              <w:left w:type="dxa" w:w="200"/>
+              <w:bottom w:type="dxa" w:w="50"/>
+              <w:right w:type="dxa" w:w="200"/>
+            </w:tcMar>
+          </w:tcPr>
+          <w:p>
+            <w:pPr>
+              <w:jc w:val="center"/>
+            </w:pPr>
+            <w:r>
+              <w:rPr>
+                <w:rFonts w:ascii="Calibri" w:cs="Calibri" w:eastAsia="Calibri" w:hAnsi="Calibri"/>
+                <w:b w:val="false"/>
+                <w:bCs w:val="false"/>
+                <w:color w:val="111827"/>
+                <w:sz w:val="17"/>
+                <w:szCs w:val="17"/>
+              </w:rPr>
+              <w:t xml:space="preserve">████████████████  100 %</w:t>
+            </w:r>
+          </w:p>
+        </w:tc>
+      </w:tr>
+      <w:tr>
+        <w:tc>
+          <w:tcPr>
+            <w:shd w:fill="EBF2FB" w:val="clear"/>
+            <w:tcMar>
+              <w:top w:type="dxa" w:w="50"/>
+              <w:left w:type="dxa" w:w="200"/>
+              <w:bottom w:type="dxa" w:w="50"/>
+              <w:right w:type="dxa" w:w="200"/>
+            </w:tcMar>
+          </w:tcPr>
+          <w:p>
+            <w:pPr>
+              <w:jc w:val="center"/>
+            </w:pPr>
+            <w:r>
+              <w:rPr>
+                <w:rFonts w:ascii="Calibri" w:cs="Calibri" w:eastAsia="Calibri" w:hAnsi="Calibri"/>
+                <w:b/>
+                <w:bCs/>
+                <w:color w:val="111827"/>
+                <w:sz w:val="17"/>
+                <w:szCs w:val="17"/>
+              </w:rPr>
+              <w:t xml:space="preserve">¿Qué redes sociales, videojuegos o plataformas utiliza...?</w:t>
+            </w:r>
+          </w:p>
+        </w:tc>
+      </w:tr>
+      <w:tr>
+        <w:tc>
+          <w:tcPr>
+            <w:shd w:fill="F3F4F6" w:val="clear"/>
+            <w:tcMar>
+              <w:top w:type="dxa" w:w="50"/>
+              <w:left w:type="dxa" w:w="200"/>
+              <w:bottom w:type="dxa" w:w="50"/>
+              <w:right w:type="dxa" w:w="200"/>
+            </w:tcMar>
+          </w:tcPr>
+          <w:p>
+            <w:pPr>
+              <w:jc w:val="center"/>
+            </w:pPr>
+            <w:r>
+              <w:rPr>
+                <w:rFonts w:ascii="Calibri" w:cs="Calibri" w:eastAsia="Calibri" w:hAnsi="Calibri"/>
+                <w:b w:val="false"/>
+                <w:bCs w:val="false"/>
+                <w:color w:val="111827"/>
+                <w:sz w:val="17"/>
+                <w:szCs w:val="17"/>
+              </w:rPr>
+              <w:t xml:space="preserve">[Área de texto libre con observaciones del aplicador]</w:t>
+            </w:r>
+          </w:p>
+        </w:tc>
+      </w:tr>
+      <w:tr>
+        <w:tc>
+          <w:tcPr>
+            <w:shd w:fill="FF007F" w:val="clear"/>
+            <w:tcMar>
+              <w:top w:type="dxa" w:w="50"/>
+              <w:left w:type="dxa" w:w="200"/>
+              <w:bottom w:type="dxa" w:w="50"/>
+              <w:right w:type="dxa" w:w="200"/>
+            </w:tcMar>
+          </w:tcPr>
+          <w:p>
+            <w:pPr>
+              <w:jc w:val="center"/>
+            </w:pPr>
+            <w:r>
+              <w:rPr>
+                <w:rFonts w:ascii="Calibri" w:cs="Calibri" w:eastAsia="Calibri" w:hAnsi="Calibri"/>
+                <w:b/>
+                <w:bCs/>
+                <w:color w:val="FFFFFF"/>
+                <w:sz w:val="17"/>
+                <w:szCs w:val="17"/>
+              </w:rPr>
+              <w:t xml:space="preserve">Ver Resultados</w:t>
+            </w:r>
+          </w:p>
+        </w:tc>
+      </w:tr>
+    </w:tbl>
     <w:p>
       <w:pPr>
         <w:spacing w:after="160"/>
@@ -7928,7 +7900,7 @@
           <w:sz w:val="18"/>
           <w:szCs w:val="18"/>
         </w:rPr>
-        <w:t xml:space="preserve">📱  Pantalla: PasoTresScreen — Resultados</w:t>
+        <w:t xml:space="preserve">Pantalla: PasoTresScreen — Resultados</w:t>
       </w:r>
     </w:p>
     <w:p>
@@ -7945,205 +7917,201 @@
           <w:sz w:val="16"/>
           <w:szCs w:val="16"/>
         </w:rPr>
-        <w:t xml:space="preserve">(Representación de la interfaz de la aplicación)</w:t>
+        <w:t xml:space="preserve">(Representacion de la interfaz de la aplicacion)</w:t>
       </w:r>
     </w:p>
-    <w:p>
-      <w:pPr>
+    <w:tbl>
+      <w:tblPr>
+        <w:tblW w:type="pct" w:w="55%"/>
         <w:jc w:val="center"/>
-      </w:pPr>
-      <w:tbl>
-        <w:tblPr>
-          <w:tblW w:type="pct" w:w="55%"/>
-          <w:tblBorders>
-            <w:top w:val="single" w:color="1B3A6B" w:sz="4"/>
-            <w:left w:val="single" w:color="1B3A6B" w:sz="4"/>
-            <w:bottom w:val="single" w:color="1B3A6B" w:sz="4"/>
-            <w:right w:val="single" w:color="1B3A6B" w:sz="4"/>
-            <w:insideH w:val="single" w:color="auto" w:sz="4"/>
-            <w:insideV w:val="single" w:color="auto" w:sz="4"/>
-          </w:tblBorders>
-        </w:tblPr>
-        <w:tblGrid>
-          <w:gridCol w:w="100"/>
-        </w:tblGrid>
-        <w:tr>
-          <w:tc>
-            <w:tcPr>
-              <w:gridSpan w:val="1"/>
-              <w:shd w:fill="1B3A6B" w:val="clear"/>
-              <w:tcMar>
-                <w:top w:type="dxa" w:w="60"/>
-                <w:left w:type="dxa" w:w="140"/>
-                <w:bottom w:type="dxa" w:w="60"/>
-                <w:right w:type="dxa" w:w="140"/>
-              </w:tcMar>
-            </w:tcPr>
-            <w:p>
-              <w:pPr>
-                <w:jc w:val="center"/>
-              </w:pPr>
-              <w:r>
-                <w:rPr>
-                  <w:rFonts w:ascii="Calibri Mono" w:cs="Calibri Mono" w:eastAsia="Calibri Mono" w:hAnsi="Calibri Mono"/>
-                  <w:b/>
-                  <w:bCs/>
-                  <w:color w:val="FFFFFF"/>
-                  <w:sz w:val="18"/>
-                  <w:szCs w:val="18"/>
-                </w:rPr>
-                <w:t xml:space="preserve">● ● ●  PasoTresScreen — Resultados</w:t>
-              </w:r>
-            </w:p>
-          </w:tc>
-        </w:tr>
-        <w:tr>
-          <w:tc>
-            <w:tcPr>
-              <w:shd w:fill="EBF2FB" w:val="clear"/>
-              <w:tcMar>
-                <w:top w:type="dxa" w:w="50"/>
-                <w:left w:type="dxa" w:w="200"/>
-                <w:bottom w:type="dxa" w:w="50"/>
-                <w:right w:type="dxa" w:w="200"/>
-              </w:tcMar>
-            </w:tcPr>
-            <w:p>
-              <w:pPr>
-                <w:jc w:val="center"/>
-              </w:pPr>
-              <w:r>
-                <w:rPr>
-                  <w:rFonts w:ascii="Calibri" w:cs="Calibri" w:eastAsia="Calibri" w:hAnsi="Calibri"/>
-                  <w:b/>
-                  <w:bCs/>
-                  <w:color w:val="111827"/>
-                  <w:sz w:val="17"/>
-                  <w:szCs w:val="17"/>
-                </w:rPr>
-                <w:t xml:space="preserve">RESULTADO DE LA ENTREVISTA</w:t>
-              </w:r>
-            </w:p>
-          </w:tc>
-        </w:tr>
-        <w:tr>
-          <w:tc>
-            <w:tcPr>
-              <w:shd w:fill="FEFCE8" w:val="clear"/>
-              <w:tcMar>
-                <w:top w:type="dxa" w:w="50"/>
-                <w:left w:type="dxa" w:w="200"/>
-                <w:bottom w:type="dxa" w:w="50"/>
-                <w:right w:type="dxa" w:w="200"/>
-              </w:tcMar>
-            </w:tcPr>
-            <w:p>
-              <w:pPr>
-                <w:jc w:val="center"/>
-              </w:pPr>
-              <w:r>
-                <w:rPr>
-                  <w:rFonts w:ascii="Calibri" w:cs="Calibri" w:eastAsia="Calibri" w:hAnsi="Calibri"/>
-                  <w:b w:val="false"/>
-                  <w:bCs w:val="false"/>
-                  <w:color w:val="111827"/>
-                  <w:sz w:val="17"/>
-                  <w:szCs w:val="17"/>
-                </w:rPr>
-                <w:t xml:space="preserve">📊  Puntajes por categoría</w:t>
-              </w:r>
-            </w:p>
-          </w:tc>
-        </w:tr>
-        <w:tr>
-          <w:tc>
-            <w:tcPr>
-              <w:shd w:fill="FFFFFF" w:val="clear"/>
-              <w:tcMar>
-                <w:top w:type="dxa" w:w="50"/>
-                <w:left w:type="dxa" w:w="200"/>
-                <w:bottom w:type="dxa" w:w="50"/>
-                <w:right w:type="dxa" w:w="200"/>
-              </w:tcMar>
-            </w:tcPr>
-            <w:p>
-              <w:pPr>
-                <w:jc w:val="center"/>
-              </w:pPr>
-              <w:r>
-                <w:rPr>
-                  <w:rFonts w:ascii="Calibri" w:cs="Calibri" w:eastAsia="Calibri" w:hAnsi="Calibri"/>
-                  <w:b w:val="false"/>
-                  <w:bCs w:val="false"/>
-                  <w:color w:val="111827"/>
-                  <w:sz w:val="17"/>
-                  <w:szCs w:val="17"/>
-                </w:rPr>
-                <w:t xml:space="preserve">🎯  Nivel de Riesgo: SIGNIFICATIVO</w:t>
-              </w:r>
-            </w:p>
-          </w:tc>
-        </w:tr>
-        <w:tr>
-          <w:tc>
-            <w:tcPr>
-              <w:shd w:fill="FEFCE8" w:val="clear"/>
-              <w:tcMar>
-                <w:top w:type="dxa" w:w="50"/>
-                <w:left w:type="dxa" w:w="200"/>
-                <w:bottom w:type="dxa" w:w="50"/>
-                <w:right w:type="dxa" w:w="200"/>
-              </w:tcMar>
-            </w:tcPr>
-            <w:p>
-              <w:pPr>
-                <w:jc w:val="center"/>
-              </w:pPr>
-              <w:r>
-                <w:rPr>
-                  <w:rFonts w:ascii="Calibri" w:cs="Calibri" w:eastAsia="Calibri" w:hAnsi="Calibri"/>
-                  <w:b w:val="false"/>
-                  <w:bCs w:val="false"/>
-                  <w:color w:val="111827"/>
-                  <w:sz w:val="17"/>
-                  <w:szCs w:val="17"/>
-                </w:rPr>
-                <w:t xml:space="preserve">💡  Recomendaciones específicas</w:t>
-              </w:r>
-            </w:p>
-          </w:tc>
-        </w:tr>
-        <w:tr>
-          <w:tc>
-            <w:tcPr>
-              <w:shd w:fill="FF007F" w:val="clear"/>
-              <w:tcMar>
-                <w:top w:type="dxa" w:w="50"/>
-                <w:left w:type="dxa" w:w="200"/>
-                <w:bottom w:type="dxa" w:w="50"/>
-                <w:right w:type="dxa" w:w="200"/>
-              </w:tcMar>
-            </w:tcPr>
-            <w:p>
-              <w:pPr>
-                <w:jc w:val="center"/>
-              </w:pPr>
-              <w:r>
-                <w:rPr>
-                  <w:rFonts w:ascii="Calibri" w:cs="Calibri" w:eastAsia="Calibri" w:hAnsi="Calibri"/>
-                  <w:b/>
-                  <w:bCs/>
-                  <w:color w:val="FFFFFF"/>
-                  <w:sz w:val="17"/>
-                  <w:szCs w:val="17"/>
-                </w:rPr>
-                <w:t xml:space="preserve">⬇️  Descargar Excel</w:t>
-              </w:r>
-            </w:p>
-          </w:tc>
-        </w:tr>
-      </w:tbl>
-    </w:p>
+        <w:tblBorders>
+          <w:top w:val="single" w:color="1B3A6B" w:sz="4"/>
+          <w:left w:val="single" w:color="1B3A6B" w:sz="4"/>
+          <w:bottom w:val="single" w:color="1B3A6B" w:sz="4"/>
+          <w:right w:val="single" w:color="1B3A6B" w:sz="4"/>
+          <w:insideH w:val="single" w:color="auto" w:sz="4"/>
+          <w:insideV w:val="single" w:color="auto" w:sz="4"/>
+        </w:tblBorders>
+      </w:tblPr>
+      <w:tblGrid>
+        <w:gridCol w:w="100"/>
+      </w:tblGrid>
+      <w:tr>
+        <w:tc>
+          <w:tcPr>
+            <w:gridSpan w:val="1"/>
+            <w:shd w:fill="1B3A6B" w:val="clear"/>
+            <w:tcMar>
+              <w:top w:type="dxa" w:w="60"/>
+              <w:left w:type="dxa" w:w="140"/>
+              <w:bottom w:type="dxa" w:w="60"/>
+              <w:right w:type="dxa" w:w="140"/>
+            </w:tcMar>
+          </w:tcPr>
+          <w:p>
+            <w:pPr>
+              <w:jc w:val="center"/>
+            </w:pPr>
+            <w:r>
+              <w:rPr>
+                <w:rFonts w:ascii="Calibri Mono" w:cs="Calibri Mono" w:eastAsia="Calibri Mono" w:hAnsi="Calibri Mono"/>
+                <w:b/>
+                <w:bCs/>
+                <w:color w:val="FFFFFF"/>
+                <w:sz w:val="18"/>
+                <w:szCs w:val="18"/>
+              </w:rPr>
+              <w:t xml:space="preserve">● ● ●  PasoTresScreen — Resultados</w:t>
+            </w:r>
+          </w:p>
+        </w:tc>
+      </w:tr>
+      <w:tr>
+        <w:tc>
+          <w:tcPr>
+            <w:shd w:fill="EBF2FB" w:val="clear"/>
+            <w:tcMar>
+              <w:top w:type="dxa" w:w="50"/>
+              <w:left w:type="dxa" w:w="200"/>
+              <w:bottom w:type="dxa" w:w="50"/>
+              <w:right w:type="dxa" w:w="200"/>
+            </w:tcMar>
+          </w:tcPr>
+          <w:p>
+            <w:pPr>
+              <w:jc w:val="center"/>
+            </w:pPr>
+            <w:r>
+              <w:rPr>
+                <w:rFonts w:ascii="Calibri" w:cs="Calibri" w:eastAsia="Calibri" w:hAnsi="Calibri"/>
+                <w:b/>
+                <w:bCs/>
+                <w:color w:val="111827"/>
+                <w:sz w:val="17"/>
+                <w:szCs w:val="17"/>
+              </w:rPr>
+              <w:t xml:space="preserve">RESULTADO DE LA ENTREVISTA</w:t>
+            </w:r>
+          </w:p>
+        </w:tc>
+      </w:tr>
+      <w:tr>
+        <w:tc>
+          <w:tcPr>
+            <w:shd w:fill="FEFCE8" w:val="clear"/>
+            <w:tcMar>
+              <w:top w:type="dxa" w:w="50"/>
+              <w:left w:type="dxa" w:w="200"/>
+              <w:bottom w:type="dxa" w:w="50"/>
+              <w:right w:type="dxa" w:w="200"/>
+            </w:tcMar>
+          </w:tcPr>
+          <w:p>
+            <w:pPr>
+              <w:jc w:val="center"/>
+            </w:pPr>
+            <w:r>
+              <w:rPr>
+                <w:rFonts w:ascii="Calibri" w:cs="Calibri" w:eastAsia="Calibri" w:hAnsi="Calibri"/>
+                <w:b w:val="false"/>
+                <w:bCs w:val="false"/>
+                <w:color w:val="111827"/>
+                <w:sz w:val="17"/>
+                <w:szCs w:val="17"/>
+              </w:rPr>
+              <w:t xml:space="preserve">📊  Puntajes por categoría</w:t>
+            </w:r>
+          </w:p>
+        </w:tc>
+      </w:tr>
+      <w:tr>
+        <w:tc>
+          <w:tcPr>
+            <w:shd w:fill="FFFFFF" w:val="clear"/>
+            <w:tcMar>
+              <w:top w:type="dxa" w:w="50"/>
+              <w:left w:type="dxa" w:w="200"/>
+              <w:bottom w:type="dxa" w:w="50"/>
+              <w:right w:type="dxa" w:w="200"/>
+            </w:tcMar>
+          </w:tcPr>
+          <w:p>
+            <w:pPr>
+              <w:jc w:val="center"/>
+            </w:pPr>
+            <w:r>
+              <w:rPr>
+                <w:rFonts w:ascii="Calibri" w:cs="Calibri" w:eastAsia="Calibri" w:hAnsi="Calibri"/>
+                <w:b w:val="false"/>
+                <w:bCs w:val="false"/>
+                <w:color w:val="111827"/>
+                <w:sz w:val="17"/>
+                <w:szCs w:val="17"/>
+              </w:rPr>
+              <w:t xml:space="preserve">🎯  Nivel de Riesgo: SIGNIFICATIVO</w:t>
+            </w:r>
+          </w:p>
+        </w:tc>
+      </w:tr>
+      <w:tr>
+        <w:tc>
+          <w:tcPr>
+            <w:shd w:fill="FEFCE8" w:val="clear"/>
+            <w:tcMar>
+              <w:top w:type="dxa" w:w="50"/>
+              <w:left w:type="dxa" w:w="200"/>
+              <w:bottom w:type="dxa" w:w="50"/>
+              <w:right w:type="dxa" w:w="200"/>
+            </w:tcMar>
+          </w:tcPr>
+          <w:p>
+            <w:pPr>
+              <w:jc w:val="center"/>
+            </w:pPr>
+            <w:r>
+              <w:rPr>
+                <w:rFonts w:ascii="Calibri" w:cs="Calibri" w:eastAsia="Calibri" w:hAnsi="Calibri"/>
+                <w:b w:val="false"/>
+                <w:bCs w:val="false"/>
+                <w:color w:val="111827"/>
+                <w:sz w:val="17"/>
+                <w:szCs w:val="17"/>
+              </w:rPr>
+              <w:t xml:space="preserve">💡  Recomendaciones específicas</w:t>
+            </w:r>
+          </w:p>
+        </w:tc>
+      </w:tr>
+      <w:tr>
+        <w:tc>
+          <w:tcPr>
+            <w:shd w:fill="FF007F" w:val="clear"/>
+            <w:tcMar>
+              <w:top w:type="dxa" w:w="50"/>
+              <w:left w:type="dxa" w:w="200"/>
+              <w:bottom w:type="dxa" w:w="50"/>
+              <w:right w:type="dxa" w:w="200"/>
+            </w:tcMar>
+          </w:tcPr>
+          <w:p>
+            <w:pPr>
+              <w:jc w:val="center"/>
+            </w:pPr>
+            <w:r>
+              <w:rPr>
+                <w:rFonts w:ascii="Calibri" w:cs="Calibri" w:eastAsia="Calibri" w:hAnsi="Calibri"/>
+                <w:b/>
+                <w:bCs/>
+                <w:color w:val="FFFFFF"/>
+                <w:sz w:val="17"/>
+                <w:szCs w:val="17"/>
+              </w:rPr>
+              <w:t xml:space="preserve">⬇️  Descargar Excel</w:t>
+            </w:r>
+          </w:p>
+        </w:tc>
+      </w:tr>
+    </w:tbl>
     <w:p>
       <w:pPr>
         <w:spacing w:after="160"/>

</xml_diff>